<commit_message>
Added a question similar to old form that asks about all violation and it answers multiple variables
</commit_message>
<xml_diff>
--- a/docassemble/MAHousingTRO/data/templates/verified_complaint_and_request_for.docx
+++ b/docassemble/MAHousingTRO/data/templates/verified_complaint_and_request_for.docx
@@ -879,15 +879,31 @@
                 <w:sz w:val="20"/>
                 <w:szCs w:val="20"/>
               </w:rPr>
-              <w:t xml:space="preserve">Plaintiff(s):  </w:t>
-            </w:r>
-            <w:r>
-              <w:rPr>
-                <w:rFonts w:ascii="Times New Roman" w:hAnsi="Times New Roman" w:eastAsia="Times New Roman" w:cs="Times New Roman"/>
-                <w:sz w:val="20"/>
-                <w:szCs w:val="20"/>
-              </w:rPr>
-              <w:t xml:space="preserve">{{ </w:t>
+              <w:t xml:space="preserve">Plaintiff(s)</w:t>
+            </w:r>
+            <w:r>
+              <w:rPr>
+                <w:rFonts w:ascii="Times New Roman" w:hAnsi="Times New Roman" w:eastAsia="Times New Roman" w:cs="Times New Roman"/>
+                <w:sz w:val="20"/>
+                <w:szCs w:val="20"/>
+              </w:rPr>
+              <w:t xml:space="preserve">:  </w:t>
+            </w:r>
+            <w:r>
+              <w:rPr>
+                <w:rFonts w:ascii="Times New Roman" w:hAnsi="Times New Roman" w:eastAsia="Times New Roman" w:cs="Times New Roman"/>
+                <w:sz w:val="20"/>
+                <w:szCs w:val="20"/>
+              </w:rPr>
+              <w:t xml:space="preserve">{</w:t>
+            </w:r>
+            <w:r>
+              <w:rPr>
+                <w:rFonts w:ascii="Times New Roman" w:hAnsi="Times New Roman" w:eastAsia="Times New Roman" w:cs="Times New Roman"/>
+                <w:sz w:val="20"/>
+                <w:szCs w:val="20"/>
+              </w:rPr>
+              <w:t xml:space="preserve">{ </w:t>
             </w:r>
             <w:r>
               <w:rPr>
@@ -896,15 +912,50 @@
                 <w:szCs w:val="20"/>
                 <w:shd w:val="clear" w:color="auto" w:fill="C7E1DD"/>
               </w:rPr>
-              <w:t>plaintiffs[0]</w:t>
-            </w:r>
-            <w:r>
-              <w:rPr>
-                <w:rFonts w:ascii="Times New Roman" w:hAnsi="Times New Roman" w:eastAsia="Times New Roman" w:cs="Times New Roman"/>
-                <w:sz w:val="20"/>
-                <w:szCs w:val="20"/>
-              </w:rPr>
-              <w:t xml:space="preserve"> }}</w:t>
+              <w:t>plaintiffs</w:t>
+            </w:r>
+            <w:r>
+              <w:rPr>
+                <w:rFonts w:ascii="Times New Roman" w:hAnsi="Times New Roman" w:eastAsia="Times New Roman" w:cs="Times New Roman"/>
+                <w:sz w:val="20"/>
+                <w:szCs w:val="20"/>
+                <w:shd w:val="clear" w:color="auto" w:fill="C7E1DD"/>
+              </w:rPr>
+              <w:t>[0</w:t>
+            </w:r>
+            <w:r>
+              <w:rPr>
+                <w:rFonts w:ascii="Times New Roman" w:hAnsi="Times New Roman" w:eastAsia="Times New Roman" w:cs="Times New Roman"/>
+                <w:sz w:val="20"/>
+                <w:szCs w:val="20"/>
+                <w:shd w:val="clear" w:color="auto" w:fill="C7E1DD"/>
+              </w:rPr>
+              <w:t>]</w:t>
+            </w:r>
+            <w:r>
+              <w:rPr>
+                <w:rFonts w:ascii="Times New Roman" w:hAnsi="Times New Roman" w:eastAsia="Times New Roman" w:cs="Times New Roman"/>
+                <w:sz w:val="20"/>
+                <w:szCs w:val="20"/>
+                <w:shd w:val="clear" w:color="auto" w:fill="C7E1DD"/>
+              </w:rPr>
+              <w:t>.name.full()</w:t>
+            </w:r>
+            <w:r>
+              <w:rPr>
+                <w:rFonts w:ascii="Times New Roman" w:hAnsi="Times New Roman" w:eastAsia="Times New Roman" w:cs="Times New Roman"/>
+                <w:sz w:val="20"/>
+                <w:szCs w:val="20"/>
+              </w:rPr>
+              <w:t xml:space="preserve"> }</w:t>
+            </w:r>
+            <w:r>
+              <w:rPr>
+                <w:rFonts w:ascii="Times New Roman" w:hAnsi="Times New Roman" w:eastAsia="Times New Roman" w:cs="Times New Roman"/>
+                <w:sz w:val="20"/>
+                <w:szCs w:val="20"/>
+              </w:rPr>
+              <w:t xml:space="preserve">}</w:t>
             </w:r>
           </w:p>
           <w:p>
@@ -1533,6 +1584,7 @@
           </w:p>
           <w:p>
             <w:pPr>
+              <w:pStyle w:val="Normal"/>
               <w:spacing w:before="0" w:beforeAutospacing="off" w:after="0" w:afterAutospacing="off" w:line="360" w:lineRule="auto"/>
             </w:pPr>
             <w:r>
@@ -1592,12 +1644,14 @@
                 <w:iCs w:val="0"/>
                 <w:strike w:val="0"/>
                 <w:dstrike w:val="0"/>
-                <w:color w:val="000000" w:themeColor="text1" w:themeTint="FF" w:themeShade="FF"/>
-                <w:sz w:val="20"/>
-                <w:szCs w:val="20"/>
-                <w:u w:val="none"/>
-              </w:rPr>
-              <w:t>violation_interference_utilities</w:t>
+                <w:noProof w:val="0"/>
+                <w:color w:val="000000" w:themeColor="text1" w:themeTint="FF" w:themeShade="FF"/>
+                <w:sz w:val="20"/>
+                <w:szCs w:val="20"/>
+                <w:u w:val="none"/>
+                <w:lang w:val="en-GB"/>
+              </w:rPr>
+              <w:t>utilities_needed</w:t>
             </w:r>
             <w:r>
               <w:rPr>

</xml_diff>

<commit_message>
Updated Template to match newest court version and added placeholders for the new questions it creates
</commit_message>
<xml_diff>
--- a/docassemble/MAHousingTRO/data/templates/verified_complaint_and_request_for.docx
+++ b/docassemble/MAHousingTRO/data/templates/verified_complaint_and_request_for.docx
@@ -44,13 +44,13 @@
               <w:spacing w:line="360" w:lineRule="auto"/>
               <w:rPr>
                 <w:rFonts w:ascii="Times New Roman" w:hAnsi="Times New Roman" w:eastAsia="Times New Roman" w:cs="Times New Roman"/>
-                <w:sz w:val="20"/>
-                <w:szCs w:val="20"/>
+                <w:sz w:val="18"/>
+                <w:szCs w:val="18"/>
               </w:rPr>
             </w:pPr>
             <w:r>
               <w:drawing>
-                <wp:inline xmlns:wp14="http://schemas.microsoft.com/office/word/2010/wordprocessingDrawing" wp14:editId="733D1122" wp14:anchorId="1B5073FF">
+                <wp:inline xmlns:wp14="http://schemas.microsoft.com/office/word/2010/wordprocessingDrawing" wp14:editId="70A9D6AE" wp14:anchorId="1B5073FF">
                   <wp:extent cx="711777" cy="711777"/>
                   <wp:effectExtent l="0" t="0" r="0" b="0"/>
                   <wp:docPr id="860523738" name="drawing"/>
@@ -236,23 +236,23 @@
               <w:spacing w:line="360" w:lineRule="auto"/>
               <w:rPr>
                 <w:rFonts w:ascii="Times New Roman" w:hAnsi="Times New Roman" w:eastAsia="Times New Roman" w:cs="Times New Roman"/>
-                <w:sz w:val="20"/>
-                <w:szCs w:val="20"/>
+                <w:sz w:val="18"/>
+                <w:szCs w:val="18"/>
               </w:rPr>
             </w:pPr>
             <w:r>
               <w:rPr>
                 <w:rFonts w:ascii="Times New Roman" w:hAnsi="Times New Roman" w:eastAsia="Times New Roman" w:cs="Times New Roman"/>
-                <w:sz w:val="20"/>
-                <w:szCs w:val="20"/>
+                <w:sz w:val="18"/>
+                <w:szCs w:val="18"/>
               </w:rPr>
               <w:t>DOCKET NO. (FOR COURT USE ONLY</w:t>
             </w:r>
             <w:r>
               <w:rPr>
                 <w:rFonts w:ascii="Times New Roman" w:hAnsi="Times New Roman" w:eastAsia="Times New Roman" w:cs="Times New Roman"/>
-                <w:sz w:val="20"/>
-                <w:szCs w:val="20"/>
+                <w:sz w:val="18"/>
+                <w:szCs w:val="18"/>
               </w:rPr>
               <w:t>)</w:t>
             </w:r>
@@ -273,15 +273,15 @@
               <w:spacing w:line="360" w:lineRule="auto"/>
               <w:rPr>
                 <w:rFonts w:ascii="Times New Roman" w:hAnsi="Times New Roman" w:eastAsia="Times New Roman" w:cs="Times New Roman"/>
-                <w:sz w:val="20"/>
-                <w:szCs w:val="20"/>
+                <w:sz w:val="18"/>
+                <w:szCs w:val="18"/>
               </w:rPr>
             </w:pPr>
             <w:r>
               <w:rPr>
                 <w:rFonts w:ascii="Times New Roman" w:hAnsi="Times New Roman" w:eastAsia="Times New Roman" w:cs="Times New Roman"/>
-                <w:sz w:val="20"/>
-                <w:szCs w:val="20"/>
+                <w:sz w:val="18"/>
+                <w:szCs w:val="18"/>
               </w:rPr>
               <w:t>COURT DEPARTMENT</w:t>
             </w:r>
@@ -294,8 +294,8 @@
                 <w:rFonts w:ascii="Times New Roman" w:hAnsi="Times New Roman" w:eastAsia="Times New Roman" w:cs="Times New Roman"/>
                 <w:b w:val="1"/>
                 <w:bCs w:val="1"/>
-                <w:sz w:val="20"/>
-                <w:szCs w:val="20"/>
+                <w:sz w:val="18"/>
+                <w:szCs w:val="18"/>
               </w:rPr>
             </w:pPr>
             <w:r>
@@ -303,8 +303,8 @@
                 <w:rFonts w:ascii="Times New Roman" w:hAnsi="Times New Roman" w:eastAsia="Times New Roman" w:cs="Times New Roman"/>
                 <w:b w:val="1"/>
                 <w:bCs w:val="1"/>
-                <w:sz w:val="20"/>
-                <w:szCs w:val="20"/>
+                <w:sz w:val="18"/>
+                <w:szCs w:val="18"/>
               </w:rPr>
               <w:t>HOUSING COURT</w:t>
             </w:r>
@@ -324,31 +324,31 @@
               <w:spacing w:line="360" w:lineRule="auto"/>
               <w:rPr>
                 <w:rFonts w:ascii="Times New Roman" w:hAnsi="Times New Roman" w:eastAsia="Times New Roman" w:cs="Times New Roman"/>
-                <w:sz w:val="20"/>
-                <w:szCs w:val="20"/>
+                <w:sz w:val="18"/>
+                <w:szCs w:val="18"/>
               </w:rPr>
             </w:pPr>
             <w:r>
               <w:rPr>
                 <w:rFonts w:ascii="Times New Roman" w:hAnsi="Times New Roman" w:eastAsia="Times New Roman" w:cs="Times New Roman"/>
-                <w:sz w:val="20"/>
-                <w:szCs w:val="20"/>
+                <w:sz w:val="18"/>
+                <w:szCs w:val="18"/>
               </w:rPr>
               <w:t>COURT</w:t>
             </w:r>
             <w:r>
               <w:rPr>
                 <w:rFonts w:ascii="Times New Roman" w:hAnsi="Times New Roman" w:eastAsia="Times New Roman" w:cs="Times New Roman"/>
-                <w:sz w:val="20"/>
-                <w:szCs w:val="20"/>
+                <w:sz w:val="18"/>
+                <w:szCs w:val="18"/>
               </w:rPr>
               <w:t xml:space="preserve"> </w:t>
             </w:r>
             <w:r>
               <w:rPr>
                 <w:rFonts w:ascii="Times New Roman" w:hAnsi="Times New Roman" w:eastAsia="Times New Roman" w:cs="Times New Roman"/>
-                <w:sz w:val="20"/>
-                <w:szCs w:val="20"/>
+                <w:sz w:val="18"/>
+                <w:szCs w:val="18"/>
               </w:rPr>
               <w:t>DIVISION/COUNTY</w:t>
             </w:r>
@@ -359,31 +359,31 @@
               <w:spacing w:line="360" w:lineRule="auto"/>
               <w:rPr>
                 <w:rFonts w:ascii="Times New Roman" w:hAnsi="Times New Roman" w:eastAsia="Times New Roman" w:cs="Times New Roman"/>
-                <w:sz w:val="20"/>
-                <w:szCs w:val="20"/>
+                <w:sz w:val="18"/>
+                <w:szCs w:val="18"/>
               </w:rPr>
             </w:pPr>
             <w:r>
               <w:rPr>
                 <w:rFonts w:ascii="Times New Roman" w:hAnsi="Times New Roman" w:eastAsia="Times New Roman" w:cs="Times New Roman"/>
-                <w:sz w:val="20"/>
-                <w:szCs w:val="20"/>
+                <w:sz w:val="18"/>
+                <w:szCs w:val="18"/>
               </w:rPr>
               <w:t xml:space="preserve">{{ </w:t>
             </w:r>
             <w:r>
               <w:rPr>
                 <w:rFonts w:ascii="Times New Roman" w:hAnsi="Times New Roman" w:eastAsia="Times New Roman" w:cs="Times New Roman"/>
-                <w:sz w:val="20"/>
-                <w:szCs w:val="20"/>
+                <w:sz w:val="18"/>
+                <w:szCs w:val="18"/>
               </w:rPr>
               <w:t>trial_court</w:t>
             </w:r>
             <w:r>
               <w:rPr>
                 <w:rFonts w:ascii="Times New Roman" w:hAnsi="Times New Roman" w:eastAsia="Times New Roman" w:cs="Times New Roman"/>
-                <w:sz w:val="20"/>
-                <w:szCs w:val="20"/>
+                <w:sz w:val="18"/>
+                <w:szCs w:val="18"/>
               </w:rPr>
               <w:t xml:space="preserve"> }}</w:t>
             </w:r>
@@ -417,8 +417,8 @@
               <w:rPr>
                 <w:rFonts w:ascii="Times New Roman" w:hAnsi="Times New Roman" w:eastAsia="Times New Roman" w:cs="Times New Roman"/>
                 <w:noProof w:val="0"/>
-                <w:sz w:val="20"/>
-                <w:szCs w:val="20"/>
+                <w:sz w:val="18"/>
+                <w:szCs w:val="18"/>
                 <w:lang w:val="en-GB"/>
               </w:rPr>
             </w:pPr>
@@ -433,8 +433,8 @@
                 <w:dstrike w:val="0"/>
                 <w:noProof w:val="0"/>
                 <w:color w:val="000000" w:themeColor="text1" w:themeTint="FF" w:themeShade="FF"/>
-                <w:sz w:val="20"/>
-                <w:szCs w:val="20"/>
+                <w:sz w:val="18"/>
+                <w:szCs w:val="18"/>
                 <w:u w:val="none"/>
                 <w:lang w:val="en-GB"/>
               </w:rPr>
@@ -451,8 +451,8 @@
                 <w:dstrike w:val="0"/>
                 <w:noProof w:val="0"/>
                 <w:color w:val="000000" w:themeColor="text1" w:themeTint="FF" w:themeShade="FF"/>
-                <w:sz w:val="20"/>
-                <w:szCs w:val="20"/>
+                <w:sz w:val="18"/>
+                <w:szCs w:val="18"/>
                 <w:u w:val="none"/>
                 <w:lang w:val="en-GB"/>
               </w:rPr>
@@ -469,8 +469,8 @@
                 <w:dstrike w:val="0"/>
                 <w:noProof w:val="0"/>
                 <w:color w:val="000000" w:themeColor="text1" w:themeTint="FF" w:themeShade="FF"/>
-                <w:sz w:val="20"/>
-                <w:szCs w:val="20"/>
+                <w:sz w:val="18"/>
+                <w:szCs w:val="18"/>
                 <w:u w:val="none"/>
                 <w:lang w:val="en-GB"/>
               </w:rPr>
@@ -487,8 +487,8 @@
                 <w:dstrike w:val="0"/>
                 <w:noProof w:val="0"/>
                 <w:color w:val="000000" w:themeColor="text1" w:themeTint="FF" w:themeShade="FF"/>
-                <w:sz w:val="20"/>
-                <w:szCs w:val="20"/>
+                <w:sz w:val="18"/>
+                <w:szCs w:val="18"/>
                 <w:u w:val="none"/>
                 <w:lang w:val="en-GB"/>
               </w:rPr>
@@ -505,8 +505,8 @@
                 <w:dstrike w:val="0"/>
                 <w:noProof w:val="0"/>
                 <w:color w:val="000000" w:themeColor="text1" w:themeTint="FF" w:themeShade="FF"/>
-                <w:sz w:val="20"/>
-                <w:szCs w:val="20"/>
+                <w:sz w:val="18"/>
+                <w:szCs w:val="18"/>
                 <w:u w:val="none"/>
                 <w:lang w:val="en-GB"/>
               </w:rPr>
@@ -523,8 +523,8 @@
                 <w:dstrike w:val="0"/>
                 <w:noProof w:val="0"/>
                 <w:color w:val="000000" w:themeColor="text1" w:themeTint="FF" w:themeShade="FF"/>
-                <w:sz w:val="20"/>
-                <w:szCs w:val="20"/>
+                <w:sz w:val="18"/>
+                <w:szCs w:val="18"/>
                 <w:u w:val="none"/>
                 <w:lang w:val="en-GB"/>
               </w:rPr>
@@ -541,8 +541,8 @@
                 <w:dstrike w:val="0"/>
                 <w:noProof w:val="0"/>
                 <w:color w:val="000000" w:themeColor="text1" w:themeTint="FF" w:themeShade="FF"/>
-                <w:sz w:val="20"/>
-                <w:szCs w:val="20"/>
+                <w:sz w:val="18"/>
+                <w:szCs w:val="18"/>
                 <w:u w:val="none"/>
                 <w:lang w:val="en-GB"/>
               </w:rPr>
@@ -559,8 +559,8 @@
                 <w:dstrike w:val="0"/>
                 <w:noProof w:val="0"/>
                 <w:color w:val="000000" w:themeColor="text1" w:themeTint="FF" w:themeShade="FF"/>
-                <w:sz w:val="20"/>
-                <w:szCs w:val="20"/>
+                <w:sz w:val="18"/>
+                <w:szCs w:val="18"/>
                 <w:u w:val="none"/>
                 <w:lang w:val="en-GB"/>
               </w:rPr>
@@ -577,8 +577,8 @@
                 <w:dstrike w:val="0"/>
                 <w:noProof w:val="0"/>
                 <w:color w:val="000000" w:themeColor="text1" w:themeTint="FF" w:themeShade="FF"/>
-                <w:sz w:val="20"/>
-                <w:szCs w:val="20"/>
+                <w:sz w:val="18"/>
+                <w:szCs w:val="18"/>
                 <w:u w:val="none"/>
                 <w:lang w:val="en-GB"/>
               </w:rPr>
@@ -595,8 +595,8 @@
                 <w:dstrike w:val="0"/>
                 <w:noProof w:val="0"/>
                 <w:color w:val="000000" w:themeColor="text1" w:themeTint="FF" w:themeShade="FF"/>
-                <w:sz w:val="20"/>
-                <w:szCs w:val="20"/>
+                <w:sz w:val="18"/>
+                <w:szCs w:val="18"/>
                 <w:u w:val="none"/>
                 <w:lang w:val="en-GB"/>
               </w:rPr>
@@ -613,8 +613,8 @@
                 <w:dstrike w:val="0"/>
                 <w:noProof w:val="0"/>
                 <w:color w:val="000000" w:themeColor="text1" w:themeTint="FF" w:themeShade="FF"/>
-                <w:sz w:val="20"/>
-                <w:szCs w:val="20"/>
+                <w:sz w:val="18"/>
+                <w:szCs w:val="18"/>
                 <w:u w:val="none"/>
                 <w:lang w:val="en-GB"/>
               </w:rPr>
@@ -631,8 +631,8 @@
                 <w:dstrike w:val="0"/>
                 <w:noProof w:val="0"/>
                 <w:color w:val="000000" w:themeColor="text1" w:themeTint="FF" w:themeShade="FF"/>
-                <w:sz w:val="20"/>
-                <w:szCs w:val="20"/>
+                <w:sz w:val="18"/>
+                <w:szCs w:val="18"/>
                 <w:u w:val="none"/>
                 <w:lang w:val="en-GB"/>
               </w:rPr>
@@ -649,8 +649,8 @@
                 <w:dstrike w:val="0"/>
                 <w:noProof w:val="0"/>
                 <w:color w:val="000000" w:themeColor="text1" w:themeTint="FF" w:themeShade="FF"/>
-                <w:sz w:val="20"/>
-                <w:szCs w:val="20"/>
+                <w:sz w:val="18"/>
+                <w:szCs w:val="18"/>
                 <w:u w:val="none"/>
                 <w:lang w:val="en-GB"/>
               </w:rPr>
@@ -667,8 +667,8 @@
                 <w:dstrike w:val="0"/>
                 <w:noProof w:val="0"/>
                 <w:color w:val="000000" w:themeColor="text1" w:themeTint="FF" w:themeShade="FF"/>
-                <w:sz w:val="20"/>
-                <w:szCs w:val="20"/>
+                <w:sz w:val="18"/>
+                <w:szCs w:val="18"/>
                 <w:u w:val="none"/>
                 <w:lang w:val="en-GB"/>
               </w:rPr>
@@ -685,8 +685,8 @@
                 <w:dstrike w:val="0"/>
                 <w:noProof w:val="0"/>
                 <w:color w:val="000000" w:themeColor="text1" w:themeTint="FF" w:themeShade="FF"/>
-                <w:sz w:val="20"/>
-                <w:szCs w:val="20"/>
+                <w:sz w:val="18"/>
+                <w:szCs w:val="18"/>
                 <w:u w:val="none"/>
                 <w:lang w:val="en-GB"/>
               </w:rPr>
@@ -703,8 +703,8 @@
                 <w:dstrike w:val="0"/>
                 <w:noProof w:val="0"/>
                 <w:color w:val="000000" w:themeColor="text1" w:themeTint="FF" w:themeShade="FF"/>
-                <w:sz w:val="20"/>
-                <w:szCs w:val="20"/>
+                <w:sz w:val="18"/>
+                <w:szCs w:val="18"/>
                 <w:u w:val="none"/>
                 <w:lang w:val="en-GB"/>
               </w:rPr>
@@ -721,8 +721,8 @@
                 <w:dstrike w:val="0"/>
                 <w:noProof w:val="0"/>
                 <w:color w:val="000000" w:themeColor="text1" w:themeTint="FF" w:themeShade="FF"/>
-                <w:sz w:val="20"/>
-                <w:szCs w:val="20"/>
+                <w:sz w:val="18"/>
+                <w:szCs w:val="18"/>
                 <w:u w:val="none"/>
                 <w:lang w:val="en-GB"/>
               </w:rPr>
@@ -739,8 +739,8 @@
                 <w:dstrike w:val="0"/>
                 <w:noProof w:val="0"/>
                 <w:color w:val="000000" w:themeColor="text1" w:themeTint="FF" w:themeShade="FF"/>
-                <w:sz w:val="20"/>
-                <w:szCs w:val="20"/>
+                <w:sz w:val="18"/>
+                <w:szCs w:val="18"/>
                 <w:u w:val="none"/>
                 <w:lang w:val="en-GB"/>
               </w:rPr>
@@ -757,8 +757,8 @@
                 <w:dstrike w:val="0"/>
                 <w:noProof w:val="0"/>
                 <w:color w:val="000000" w:themeColor="text1" w:themeTint="FF" w:themeShade="FF"/>
-                <w:sz w:val="20"/>
-                <w:szCs w:val="20"/>
+                <w:sz w:val="18"/>
+                <w:szCs w:val="18"/>
                 <w:u w:val="none"/>
                 <w:lang w:val="en-GB"/>
               </w:rPr>
@@ -775,8 +775,8 @@
                 <w:dstrike w:val="0"/>
                 <w:noProof w:val="0"/>
                 <w:color w:val="000000" w:themeColor="text1" w:themeTint="FF" w:themeShade="FF"/>
-                <w:sz w:val="20"/>
-                <w:szCs w:val="20"/>
+                <w:sz w:val="18"/>
+                <w:szCs w:val="18"/>
                 <w:u w:val="none"/>
                 <w:lang w:val="en-GB"/>
               </w:rPr>
@@ -802,8 +802,8 @@
               <w:ind w:left="720" w:hanging="720"/>
               <w:rPr>
                 <w:rFonts w:ascii="Times New Roman" w:hAnsi="Times New Roman" w:eastAsia="Times New Roman" w:cs="Times New Roman"/>
-                <w:sz w:val="20"/>
-                <w:szCs w:val="20"/>
+                <w:sz w:val="18"/>
+                <w:szCs w:val="18"/>
               </w:rPr>
             </w:pPr>
             <w:r>
@@ -811,8 +811,8 @@
                 <w:rFonts w:ascii="Times New Roman" w:hAnsi="Times New Roman" w:eastAsia="Times New Roman" w:cs="Times New Roman"/>
                 <w:b w:val="1"/>
                 <w:bCs w:val="1"/>
-                <w:sz w:val="20"/>
-                <w:szCs w:val="20"/>
+                <w:sz w:val="18"/>
+                <w:szCs w:val="18"/>
               </w:rPr>
               <w:t xml:space="preserve">DOCKET NO. </w:t>
             </w:r>
@@ -821,8 +821,8 @@
                 <w:rFonts w:ascii="Times New Roman" w:hAnsi="Times New Roman" w:eastAsia="Times New Roman" w:cs="Times New Roman"/>
                 <w:b w:val="1"/>
                 <w:bCs w:val="1"/>
-                <w:sz w:val="20"/>
-                <w:szCs w:val="20"/>
+                <w:sz w:val="18"/>
+                <w:szCs w:val="18"/>
               </w:rPr>
               <w:t xml:space="preserve">{{ </w:t>
             </w:r>
@@ -831,8 +831,8 @@
                 <w:rFonts w:ascii="Times New Roman" w:hAnsi="Times New Roman" w:eastAsia="Times New Roman" w:cs="Times New Roman"/>
                 <w:b w:val="0"/>
                 <w:bCs w:val="0"/>
-                <w:sz w:val="20"/>
-                <w:szCs w:val="20"/>
+                <w:sz w:val="18"/>
+                <w:szCs w:val="18"/>
                 <w:shd w:val="clear" w:color="auto" w:fill="C7E1DD"/>
               </w:rPr>
               <w:t>docket_number</w:t>
@@ -842,8 +842,8 @@
                 <w:rFonts w:ascii="Times New Roman" w:hAnsi="Times New Roman" w:eastAsia="Times New Roman" w:cs="Times New Roman"/>
                 <w:b w:val="1"/>
                 <w:bCs w:val="1"/>
-                <w:sz w:val="20"/>
-                <w:szCs w:val="20"/>
+                <w:sz w:val="18"/>
+                <w:szCs w:val="18"/>
               </w:rPr>
               <w:t xml:space="preserve"> }}</w:t>
             </w:r>
@@ -869,47 +869,47 @@
               <w:spacing w:line="360" w:lineRule="auto"/>
               <w:rPr>
                 <w:rFonts w:ascii="Times New Roman" w:hAnsi="Times New Roman" w:eastAsia="Times New Roman" w:cs="Times New Roman"/>
-                <w:sz w:val="20"/>
-                <w:szCs w:val="20"/>
+                <w:sz w:val="18"/>
+                <w:szCs w:val="18"/>
               </w:rPr>
             </w:pPr>
             <w:r>
               <w:rPr>
                 <w:rFonts w:ascii="Times New Roman" w:hAnsi="Times New Roman" w:eastAsia="Times New Roman" w:cs="Times New Roman"/>
-                <w:sz w:val="20"/>
-                <w:szCs w:val="20"/>
+                <w:sz w:val="18"/>
+                <w:szCs w:val="18"/>
               </w:rPr>
               <w:t xml:space="preserve">Plaintiff(s)</w:t>
             </w:r>
             <w:r>
               <w:rPr>
                 <w:rFonts w:ascii="Times New Roman" w:hAnsi="Times New Roman" w:eastAsia="Times New Roman" w:cs="Times New Roman"/>
-                <w:sz w:val="20"/>
-                <w:szCs w:val="20"/>
+                <w:sz w:val="18"/>
+                <w:szCs w:val="18"/>
               </w:rPr>
               <w:t xml:space="preserve">:  </w:t>
             </w:r>
             <w:r>
               <w:rPr>
                 <w:rFonts w:ascii="Times New Roman" w:hAnsi="Times New Roman" w:eastAsia="Times New Roman" w:cs="Times New Roman"/>
-                <w:sz w:val="20"/>
-                <w:szCs w:val="20"/>
+                <w:sz w:val="18"/>
+                <w:szCs w:val="18"/>
               </w:rPr>
               <w:t xml:space="preserve">{</w:t>
             </w:r>
             <w:r>
               <w:rPr>
                 <w:rFonts w:ascii="Times New Roman" w:hAnsi="Times New Roman" w:eastAsia="Times New Roman" w:cs="Times New Roman"/>
-                <w:sz w:val="20"/>
-                <w:szCs w:val="20"/>
+                <w:sz w:val="18"/>
+                <w:szCs w:val="18"/>
               </w:rPr>
               <w:t xml:space="preserve">{ </w:t>
             </w:r>
             <w:r>
               <w:rPr>
                 <w:rFonts w:ascii="Times New Roman" w:hAnsi="Times New Roman" w:eastAsia="Times New Roman" w:cs="Times New Roman"/>
-                <w:sz w:val="20"/>
-                <w:szCs w:val="20"/>
+                <w:sz w:val="18"/>
+                <w:szCs w:val="18"/>
                 <w:shd w:val="clear" w:color="auto" w:fill="C7E1DD"/>
               </w:rPr>
               <w:t>plaintiffs</w:t>
@@ -917,8 +917,8 @@
             <w:r>
               <w:rPr>
                 <w:rFonts w:ascii="Times New Roman" w:hAnsi="Times New Roman" w:eastAsia="Times New Roman" w:cs="Times New Roman"/>
-                <w:sz w:val="20"/>
-                <w:szCs w:val="20"/>
+                <w:sz w:val="18"/>
+                <w:szCs w:val="18"/>
                 <w:shd w:val="clear" w:color="auto" w:fill="C7E1DD"/>
               </w:rPr>
               <w:t>[0</w:t>
@@ -926,8 +926,8 @@
             <w:r>
               <w:rPr>
                 <w:rFonts w:ascii="Times New Roman" w:hAnsi="Times New Roman" w:eastAsia="Times New Roman" w:cs="Times New Roman"/>
-                <w:sz w:val="20"/>
-                <w:szCs w:val="20"/>
+                <w:sz w:val="18"/>
+                <w:szCs w:val="18"/>
                 <w:shd w:val="clear" w:color="auto" w:fill="C7E1DD"/>
               </w:rPr>
               <w:t>]</w:t>
@@ -935,8 +935,8 @@
             <w:r>
               <w:rPr>
                 <w:rFonts w:ascii="Times New Roman" w:hAnsi="Times New Roman" w:eastAsia="Times New Roman" w:cs="Times New Roman"/>
-                <w:sz w:val="20"/>
-                <w:szCs w:val="20"/>
+                <w:sz w:val="18"/>
+                <w:szCs w:val="18"/>
                 <w:shd w:val="clear" w:color="auto" w:fill="C7E1DD"/>
               </w:rPr>
               <w:t>.name.full()</w:t>
@@ -944,16 +944,16 @@
             <w:r>
               <w:rPr>
                 <w:rFonts w:ascii="Times New Roman" w:hAnsi="Times New Roman" w:eastAsia="Times New Roman" w:cs="Times New Roman"/>
-                <w:sz w:val="20"/>
-                <w:szCs w:val="20"/>
+                <w:sz w:val="18"/>
+                <w:szCs w:val="18"/>
               </w:rPr>
               <w:t xml:space="preserve"> }</w:t>
             </w:r>
             <w:r>
               <w:rPr>
                 <w:rFonts w:ascii="Times New Roman" w:hAnsi="Times New Roman" w:eastAsia="Times New Roman" w:cs="Times New Roman"/>
-                <w:sz w:val="20"/>
-                <w:szCs w:val="20"/>
+                <w:sz w:val="18"/>
+                <w:szCs w:val="18"/>
               </w:rPr>
               <w:t xml:space="preserve">}</w:t>
             </w:r>
@@ -964,31 +964,31 @@
               <w:spacing w:line="360" w:lineRule="auto"/>
               <w:rPr>
                 <w:rFonts w:ascii="Times New Roman" w:hAnsi="Times New Roman" w:eastAsia="Times New Roman" w:cs="Times New Roman"/>
-                <w:sz w:val="20"/>
-                <w:szCs w:val="20"/>
+                <w:sz w:val="18"/>
+                <w:szCs w:val="18"/>
               </w:rPr>
             </w:pPr>
             <w:r>
               <w:rPr>
                 <w:rFonts w:ascii="Times New Roman" w:hAnsi="Times New Roman" w:eastAsia="Times New Roman" w:cs="Times New Roman"/>
-                <w:sz w:val="20"/>
-                <w:szCs w:val="20"/>
+                <w:sz w:val="18"/>
+                <w:szCs w:val="18"/>
               </w:rPr>
               <w:t xml:space="preserve">Address: </w:t>
             </w:r>
             <w:r>
               <w:rPr>
                 <w:rFonts w:ascii="Times New Roman" w:hAnsi="Times New Roman" w:eastAsia="Times New Roman" w:cs="Times New Roman"/>
-                <w:sz w:val="20"/>
-                <w:szCs w:val="20"/>
+                <w:sz w:val="18"/>
+                <w:szCs w:val="18"/>
               </w:rPr>
               <w:t xml:space="preserve">{{ </w:t>
             </w:r>
             <w:r>
               <w:rPr>
                 <w:rFonts w:ascii="Times New Roman" w:hAnsi="Times New Roman" w:eastAsia="Times New Roman" w:cs="Times New Roman"/>
-                <w:sz w:val="20"/>
-                <w:szCs w:val="20"/>
+                <w:sz w:val="18"/>
+                <w:szCs w:val="18"/>
                 <w:shd w:val="clear" w:color="auto" w:fill="C7E1DD"/>
               </w:rPr>
               <w:t>plaintiffs[0].address.line_one()</w:t>
@@ -996,8 +996,8 @@
             <w:r>
               <w:rPr>
                 <w:rFonts w:ascii="Times New Roman" w:hAnsi="Times New Roman" w:eastAsia="Times New Roman" w:cs="Times New Roman"/>
-                <w:sz w:val="20"/>
-                <w:szCs w:val="20"/>
+                <w:sz w:val="18"/>
+                <w:szCs w:val="18"/>
               </w:rPr>
               <w:t xml:space="preserve"> }}</w:t>
             </w:r>
@@ -1008,31 +1008,31 @@
               <w:spacing w:line="360" w:lineRule="auto"/>
               <w:rPr>
                 <w:rFonts w:ascii="Times New Roman" w:hAnsi="Times New Roman" w:eastAsia="Times New Roman" w:cs="Times New Roman"/>
-                <w:sz w:val="20"/>
-                <w:szCs w:val="20"/>
+                <w:sz w:val="18"/>
+                <w:szCs w:val="18"/>
               </w:rPr>
             </w:pPr>
             <w:r>
               <w:rPr>
                 <w:rFonts w:ascii="Times New Roman" w:hAnsi="Times New Roman" w:eastAsia="Times New Roman" w:cs="Times New Roman"/>
-                <w:sz w:val="20"/>
-                <w:szCs w:val="20"/>
+                <w:sz w:val="18"/>
+                <w:szCs w:val="18"/>
               </w:rPr>
               <w:t xml:space="preserve">City: </w:t>
             </w:r>
             <w:r>
               <w:rPr>
                 <w:rFonts w:ascii="Times New Roman" w:hAnsi="Times New Roman" w:eastAsia="Times New Roman" w:cs="Times New Roman"/>
-                <w:sz w:val="20"/>
-                <w:szCs w:val="20"/>
+                <w:sz w:val="18"/>
+                <w:szCs w:val="18"/>
               </w:rPr>
               <w:t xml:space="preserve">{{ </w:t>
             </w:r>
             <w:r>
               <w:rPr>
                 <w:rFonts w:ascii="Times New Roman" w:hAnsi="Times New Roman" w:eastAsia="Times New Roman" w:cs="Times New Roman"/>
-                <w:sz w:val="20"/>
-                <w:szCs w:val="20"/>
+                <w:sz w:val="18"/>
+                <w:szCs w:val="18"/>
                 <w:shd w:val="clear" w:color="auto" w:fill="C7E1DD"/>
               </w:rPr>
               <w:t>plaintiffs[0].address.city</w:t>
@@ -1040,8 +1040,8 @@
             <w:r>
               <w:rPr>
                 <w:rFonts w:ascii="Times New Roman" w:hAnsi="Times New Roman" w:eastAsia="Times New Roman" w:cs="Times New Roman"/>
-                <w:sz w:val="20"/>
-                <w:szCs w:val="20"/>
+                <w:sz w:val="18"/>
+                <w:szCs w:val="18"/>
               </w:rPr>
               <w:t xml:space="preserve"> }}</w:t>
             </w:r>
@@ -1052,31 +1052,31 @@
               <w:spacing w:line="360" w:lineRule="auto"/>
               <w:rPr>
                 <w:rFonts w:ascii="Times New Roman" w:hAnsi="Times New Roman" w:eastAsia="Times New Roman" w:cs="Times New Roman"/>
-                <w:sz w:val="20"/>
-                <w:szCs w:val="20"/>
+                <w:sz w:val="18"/>
+                <w:szCs w:val="18"/>
               </w:rPr>
             </w:pPr>
             <w:r>
               <w:rPr>
                 <w:rFonts w:ascii="Times New Roman" w:hAnsi="Times New Roman" w:eastAsia="Times New Roman" w:cs="Times New Roman"/>
-                <w:sz w:val="20"/>
-                <w:szCs w:val="20"/>
+                <w:sz w:val="18"/>
+                <w:szCs w:val="18"/>
               </w:rPr>
               <w:t xml:space="preserve">Phone: </w:t>
             </w:r>
             <w:r>
               <w:rPr>
                 <w:rFonts w:ascii="Times New Roman" w:hAnsi="Times New Roman" w:eastAsia="Times New Roman" w:cs="Times New Roman"/>
-                <w:sz w:val="20"/>
-                <w:szCs w:val="20"/>
+                <w:sz w:val="18"/>
+                <w:szCs w:val="18"/>
               </w:rPr>
               <w:t xml:space="preserve">{{ </w:t>
             </w:r>
             <w:r>
               <w:rPr>
                 <w:rFonts w:ascii="Times New Roman" w:hAnsi="Times New Roman" w:eastAsia="Times New Roman" w:cs="Times New Roman"/>
-                <w:sz w:val="20"/>
-                <w:szCs w:val="20"/>
+                <w:sz w:val="18"/>
+                <w:szCs w:val="18"/>
                 <w:shd w:val="clear" w:color="auto" w:fill="C7E1DD"/>
               </w:rPr>
               <w:t>plaintiffs[0].phone_number</w:t>
@@ -1084,8 +1084,8 @@
             <w:r>
               <w:rPr>
                 <w:rFonts w:ascii="Times New Roman" w:hAnsi="Times New Roman" w:eastAsia="Times New Roman" w:cs="Times New Roman"/>
-                <w:sz w:val="20"/>
-                <w:szCs w:val="20"/>
+                <w:sz w:val="18"/>
+                <w:szCs w:val="18"/>
               </w:rPr>
               <w:t xml:space="preserve"> }}</w:t>
             </w:r>
@@ -1096,31 +1096,31 @@
               <w:spacing w:line="360" w:lineRule="auto"/>
               <w:rPr>
                 <w:rFonts w:ascii="Times New Roman" w:hAnsi="Times New Roman" w:eastAsia="Times New Roman" w:cs="Times New Roman"/>
-                <w:sz w:val="20"/>
-                <w:szCs w:val="20"/>
+                <w:sz w:val="18"/>
+                <w:szCs w:val="18"/>
               </w:rPr>
             </w:pPr>
             <w:r>
               <w:rPr>
                 <w:rFonts w:ascii="Times New Roman" w:hAnsi="Times New Roman" w:eastAsia="Times New Roman" w:cs="Times New Roman"/>
-                <w:sz w:val="20"/>
-                <w:szCs w:val="20"/>
+                <w:sz w:val="18"/>
+                <w:szCs w:val="18"/>
               </w:rPr>
               <w:t xml:space="preserve">Email: </w:t>
             </w:r>
             <w:r>
               <w:rPr>
                 <w:rFonts w:ascii="Times New Roman" w:hAnsi="Times New Roman" w:eastAsia="Times New Roman" w:cs="Times New Roman"/>
-                <w:sz w:val="20"/>
-                <w:szCs w:val="20"/>
+                <w:sz w:val="18"/>
+                <w:szCs w:val="18"/>
               </w:rPr>
               <w:t xml:space="preserve">{{ </w:t>
             </w:r>
             <w:r>
               <w:rPr>
                 <w:rFonts w:ascii="Times New Roman" w:hAnsi="Times New Roman" w:eastAsia="Times New Roman" w:cs="Times New Roman"/>
-                <w:sz w:val="20"/>
-                <w:szCs w:val="20"/>
+                <w:sz w:val="18"/>
+                <w:szCs w:val="18"/>
                 <w:shd w:val="clear" w:color="auto" w:fill="C7E1DD"/>
               </w:rPr>
               <w:t>plaintiffs[0].email</w:t>
@@ -1128,8 +1128,8 @@
             <w:r>
               <w:rPr>
                 <w:rFonts w:ascii="Times New Roman" w:hAnsi="Times New Roman" w:eastAsia="Times New Roman" w:cs="Times New Roman"/>
-                <w:sz w:val="20"/>
-                <w:szCs w:val="20"/>
+                <w:sz w:val="18"/>
+                <w:szCs w:val="18"/>
               </w:rPr>
               <w:t xml:space="preserve"> }}</w:t>
             </w:r>
@@ -1151,31 +1151,31 @@
               <w:jc w:val="left"/>
               <w:rPr>
                 <w:rFonts w:ascii="Times New Roman" w:hAnsi="Times New Roman" w:eastAsia="Times New Roman" w:cs="Times New Roman"/>
-                <w:sz w:val="20"/>
-                <w:szCs w:val="20"/>
+                <w:sz w:val="18"/>
+                <w:szCs w:val="18"/>
               </w:rPr>
             </w:pPr>
             <w:r>
               <w:rPr>
                 <w:rFonts w:ascii="Times New Roman" w:hAnsi="Times New Roman" w:eastAsia="Times New Roman" w:cs="Times New Roman"/>
-                <w:sz w:val="20"/>
-                <w:szCs w:val="20"/>
+                <w:sz w:val="18"/>
+                <w:szCs w:val="18"/>
               </w:rPr>
               <w:t xml:space="preserve">Defendant(s): </w:t>
             </w:r>
             <w:r>
               <w:rPr>
                 <w:rFonts w:ascii="Times New Roman" w:hAnsi="Times New Roman" w:eastAsia="Times New Roman" w:cs="Times New Roman"/>
-                <w:sz w:val="20"/>
-                <w:szCs w:val="20"/>
+                <w:sz w:val="18"/>
+                <w:szCs w:val="18"/>
               </w:rPr>
               <w:t xml:space="preserve">{{ </w:t>
             </w:r>
             <w:r>
               <w:rPr>
                 <w:rFonts w:ascii="Times New Roman" w:hAnsi="Times New Roman" w:eastAsia="Times New Roman" w:cs="Times New Roman"/>
-                <w:sz w:val="20"/>
-                <w:szCs w:val="20"/>
+                <w:sz w:val="18"/>
+                <w:szCs w:val="18"/>
                 <w:shd w:val="clear" w:color="auto" w:fill="C7E1DD"/>
               </w:rPr>
               <w:t>defendants[0].name.full()</w:t>
@@ -1183,8 +1183,8 @@
             <w:r>
               <w:rPr>
                 <w:rFonts w:ascii="Times New Roman" w:hAnsi="Times New Roman" w:eastAsia="Times New Roman" w:cs="Times New Roman"/>
-                <w:sz w:val="20"/>
-                <w:szCs w:val="20"/>
+                <w:sz w:val="18"/>
+                <w:szCs w:val="18"/>
               </w:rPr>
               <w:t xml:space="preserve"> }}</w:t>
             </w:r>
@@ -1195,31 +1195,31 @@
               <w:spacing w:line="360" w:lineRule="auto"/>
               <w:rPr>
                 <w:rFonts w:ascii="Times New Roman" w:hAnsi="Times New Roman" w:eastAsia="Times New Roman" w:cs="Times New Roman"/>
-                <w:sz w:val="20"/>
-                <w:szCs w:val="20"/>
+                <w:sz w:val="18"/>
+                <w:szCs w:val="18"/>
               </w:rPr>
             </w:pPr>
             <w:r>
               <w:rPr>
                 <w:rFonts w:ascii="Times New Roman" w:hAnsi="Times New Roman" w:eastAsia="Times New Roman" w:cs="Times New Roman"/>
-                <w:sz w:val="20"/>
-                <w:szCs w:val="20"/>
+                <w:sz w:val="18"/>
+                <w:szCs w:val="18"/>
               </w:rPr>
               <w:t xml:space="preserve">Address: </w:t>
             </w:r>
             <w:r>
               <w:rPr>
                 <w:rFonts w:ascii="Times New Roman" w:hAnsi="Times New Roman" w:eastAsia="Times New Roman" w:cs="Times New Roman"/>
-                <w:sz w:val="20"/>
-                <w:szCs w:val="20"/>
+                <w:sz w:val="18"/>
+                <w:szCs w:val="18"/>
               </w:rPr>
               <w:t xml:space="preserve">{{ </w:t>
             </w:r>
             <w:r>
               <w:rPr>
                 <w:rFonts w:ascii="Times New Roman" w:hAnsi="Times New Roman" w:eastAsia="Times New Roman" w:cs="Times New Roman"/>
-                <w:sz w:val="20"/>
-                <w:szCs w:val="20"/>
+                <w:sz w:val="18"/>
+                <w:szCs w:val="18"/>
                 <w:shd w:val="clear" w:color="auto" w:fill="C7E1DD"/>
               </w:rPr>
               <w:t>defendants[0].address.line_one()</w:t>
@@ -1227,8 +1227,8 @@
             <w:r>
               <w:rPr>
                 <w:rFonts w:ascii="Times New Roman" w:hAnsi="Times New Roman" w:eastAsia="Times New Roman" w:cs="Times New Roman"/>
-                <w:sz w:val="20"/>
-                <w:szCs w:val="20"/>
+                <w:sz w:val="18"/>
+                <w:szCs w:val="18"/>
               </w:rPr>
               <w:t xml:space="preserve"> }}</w:t>
             </w:r>
@@ -1239,31 +1239,31 @@
               <w:spacing w:line="360" w:lineRule="auto"/>
               <w:rPr>
                 <w:rFonts w:ascii="Times New Roman" w:hAnsi="Times New Roman" w:eastAsia="Times New Roman" w:cs="Times New Roman"/>
-                <w:sz w:val="20"/>
-                <w:szCs w:val="20"/>
+                <w:sz w:val="18"/>
+                <w:szCs w:val="18"/>
               </w:rPr>
             </w:pPr>
             <w:r>
               <w:rPr>
                 <w:rFonts w:ascii="Times New Roman" w:hAnsi="Times New Roman" w:eastAsia="Times New Roman" w:cs="Times New Roman"/>
-                <w:sz w:val="20"/>
-                <w:szCs w:val="20"/>
+                <w:sz w:val="18"/>
+                <w:szCs w:val="18"/>
               </w:rPr>
               <w:t xml:space="preserve">City: </w:t>
             </w:r>
             <w:r>
               <w:rPr>
                 <w:rFonts w:ascii="Times New Roman" w:hAnsi="Times New Roman" w:eastAsia="Times New Roman" w:cs="Times New Roman"/>
-                <w:sz w:val="20"/>
-                <w:szCs w:val="20"/>
+                <w:sz w:val="18"/>
+                <w:szCs w:val="18"/>
               </w:rPr>
               <w:t xml:space="preserve">{{ </w:t>
             </w:r>
             <w:r>
               <w:rPr>
                 <w:rFonts w:ascii="Times New Roman" w:hAnsi="Times New Roman" w:eastAsia="Times New Roman" w:cs="Times New Roman"/>
-                <w:sz w:val="20"/>
-                <w:szCs w:val="20"/>
+                <w:sz w:val="18"/>
+                <w:szCs w:val="18"/>
                 <w:shd w:val="clear" w:color="auto" w:fill="C7E1DD"/>
               </w:rPr>
               <w:t>defendants[0].address.city</w:t>
@@ -1271,8 +1271,8 @@
             <w:r>
               <w:rPr>
                 <w:rFonts w:ascii="Times New Roman" w:hAnsi="Times New Roman" w:eastAsia="Times New Roman" w:cs="Times New Roman"/>
-                <w:sz w:val="20"/>
-                <w:szCs w:val="20"/>
+                <w:sz w:val="18"/>
+                <w:szCs w:val="18"/>
               </w:rPr>
               <w:t xml:space="preserve"> }}</w:t>
             </w:r>
@@ -1283,31 +1283,31 @@
               <w:spacing w:line="360" w:lineRule="auto"/>
               <w:rPr>
                 <w:rFonts w:ascii="Times New Roman" w:hAnsi="Times New Roman" w:eastAsia="Times New Roman" w:cs="Times New Roman"/>
-                <w:sz w:val="20"/>
-                <w:szCs w:val="20"/>
+                <w:sz w:val="18"/>
+                <w:szCs w:val="18"/>
               </w:rPr>
             </w:pPr>
             <w:r>
               <w:rPr>
                 <w:rFonts w:ascii="Times New Roman" w:hAnsi="Times New Roman" w:eastAsia="Times New Roman" w:cs="Times New Roman"/>
-                <w:sz w:val="20"/>
-                <w:szCs w:val="20"/>
+                <w:sz w:val="18"/>
+                <w:szCs w:val="18"/>
               </w:rPr>
               <w:t xml:space="preserve">Phone: </w:t>
             </w:r>
             <w:r>
               <w:rPr>
                 <w:rFonts w:ascii="Times New Roman" w:hAnsi="Times New Roman" w:eastAsia="Times New Roman" w:cs="Times New Roman"/>
-                <w:sz w:val="20"/>
-                <w:szCs w:val="20"/>
+                <w:sz w:val="18"/>
+                <w:szCs w:val="18"/>
               </w:rPr>
               <w:t xml:space="preserve">{{ </w:t>
             </w:r>
             <w:r>
               <w:rPr>
                 <w:rFonts w:ascii="Times New Roman" w:hAnsi="Times New Roman" w:eastAsia="Times New Roman" w:cs="Times New Roman"/>
-                <w:sz w:val="20"/>
-                <w:szCs w:val="20"/>
+                <w:sz w:val="18"/>
+                <w:szCs w:val="18"/>
                 <w:shd w:val="clear" w:color="auto" w:fill="C7E1DD"/>
               </w:rPr>
               <w:t>defendants[0].phone_number</w:t>
@@ -1315,8 +1315,8 @@
             <w:r>
               <w:rPr>
                 <w:rFonts w:ascii="Times New Roman" w:hAnsi="Times New Roman" w:eastAsia="Times New Roman" w:cs="Times New Roman"/>
-                <w:sz w:val="20"/>
-                <w:szCs w:val="20"/>
+                <w:sz w:val="18"/>
+                <w:szCs w:val="18"/>
               </w:rPr>
               <w:t xml:space="preserve"> }}</w:t>
             </w:r>
@@ -1327,31 +1327,31 @@
               <w:spacing w:line="360" w:lineRule="auto"/>
               <w:rPr>
                 <w:rFonts w:ascii="Times New Roman" w:hAnsi="Times New Roman" w:eastAsia="Times New Roman" w:cs="Times New Roman"/>
-                <w:sz w:val="20"/>
-                <w:szCs w:val="20"/>
+                <w:sz w:val="18"/>
+                <w:szCs w:val="18"/>
               </w:rPr>
             </w:pPr>
             <w:r>
               <w:rPr>
                 <w:rFonts w:ascii="Times New Roman" w:hAnsi="Times New Roman" w:eastAsia="Times New Roman" w:cs="Times New Roman"/>
-                <w:sz w:val="20"/>
-                <w:szCs w:val="20"/>
+                <w:sz w:val="18"/>
+                <w:szCs w:val="18"/>
               </w:rPr>
               <w:t xml:space="preserve">Email: </w:t>
             </w:r>
             <w:r>
               <w:rPr>
                 <w:rFonts w:ascii="Times New Roman" w:hAnsi="Times New Roman" w:eastAsia="Times New Roman" w:cs="Times New Roman"/>
-                <w:sz w:val="20"/>
-                <w:szCs w:val="20"/>
+                <w:sz w:val="18"/>
+                <w:szCs w:val="18"/>
               </w:rPr>
               <w:t xml:space="preserve">{{ </w:t>
             </w:r>
             <w:r>
               <w:rPr>
                 <w:rFonts w:ascii="Times New Roman" w:hAnsi="Times New Roman" w:eastAsia="Times New Roman" w:cs="Times New Roman"/>
-                <w:sz w:val="20"/>
-                <w:szCs w:val="20"/>
+                <w:sz w:val="18"/>
+                <w:szCs w:val="18"/>
                 <w:shd w:val="clear" w:color="auto" w:fill="C7E1DD"/>
               </w:rPr>
               <w:t>defendants[0].email</w:t>
@@ -1359,8 +1359,8 @@
             <w:r>
               <w:rPr>
                 <w:rFonts w:ascii="Times New Roman" w:hAnsi="Times New Roman" w:eastAsia="Times New Roman" w:cs="Times New Roman"/>
-                <w:sz w:val="20"/>
-                <w:szCs w:val="20"/>
+                <w:sz w:val="18"/>
+                <w:szCs w:val="18"/>
               </w:rPr>
               <w:t xml:space="preserve"> }}</w:t>
             </w:r>
@@ -1383,15 +1383,15 @@
               <w:spacing w:line="360" w:lineRule="auto"/>
               <w:rPr>
                 <w:rFonts w:ascii="Times New Roman" w:hAnsi="Times New Roman" w:eastAsia="Times New Roman" w:cs="Times New Roman"/>
-                <w:sz w:val="20"/>
-                <w:szCs w:val="20"/>
+                <w:sz w:val="18"/>
+                <w:szCs w:val="18"/>
               </w:rPr>
             </w:pPr>
             <w:r>
               <w:rPr>
                 <w:rFonts w:ascii="Times New Roman" w:hAnsi="Times New Roman" w:eastAsia="Times New Roman" w:cs="Times New Roman"/>
-                <w:sz w:val="20"/>
-                <w:szCs w:val="20"/>
+                <w:sz w:val="18"/>
+                <w:szCs w:val="18"/>
               </w:rPr>
               <w:t xml:space="preserve">Briefly describe the facts, date(s), and time of events (if any) that have occurred: </w:t>
             </w:r>
@@ -1402,31 +1402,31 @@
               <w:spacing w:line="360" w:lineRule="auto"/>
               <w:rPr>
                 <w:rFonts w:ascii="Times New Roman" w:hAnsi="Times New Roman" w:eastAsia="Times New Roman" w:cs="Times New Roman"/>
-                <w:sz w:val="20"/>
-                <w:szCs w:val="20"/>
+                <w:sz w:val="18"/>
+                <w:szCs w:val="18"/>
               </w:rPr>
             </w:pPr>
             <w:r>
               <w:rPr>
                 <w:rFonts w:ascii="Times New Roman" w:hAnsi="Times New Roman" w:eastAsia="Times New Roman" w:cs="Times New Roman"/>
-                <w:sz w:val="20"/>
-                <w:szCs w:val="20"/>
+                <w:sz w:val="18"/>
+                <w:szCs w:val="18"/>
               </w:rPr>
               <w:t xml:space="preserve">{{</w:t>
             </w:r>
             <w:r>
               <w:rPr>
                 <w:rFonts w:ascii="Times New Roman" w:hAnsi="Times New Roman" w:eastAsia="Times New Roman" w:cs="Times New Roman"/>
-                <w:sz w:val="20"/>
-                <w:szCs w:val="20"/>
+                <w:sz w:val="18"/>
+                <w:szCs w:val="18"/>
               </w:rPr>
               <w:t xml:space="preserve"> </w:t>
             </w:r>
             <w:r>
               <w:rPr>
                 <w:rFonts w:ascii="Times New Roman" w:hAnsi="Times New Roman" w:eastAsia="Times New Roman" w:cs="Times New Roman"/>
-                <w:sz w:val="20"/>
-                <w:szCs w:val="20"/>
+                <w:sz w:val="18"/>
+                <w:szCs w:val="18"/>
                 <w:shd w:val="clear" w:color="auto" w:fill="C7E1DD"/>
               </w:rPr>
               <w:t>facts_description</w:t>
@@ -1434,16 +1434,16 @@
             <w:r>
               <w:rPr>
                 <w:rFonts w:ascii="Times New Roman" w:hAnsi="Times New Roman" w:eastAsia="Times New Roman" w:cs="Times New Roman"/>
-                <w:sz w:val="20"/>
-                <w:szCs w:val="20"/>
+                <w:sz w:val="18"/>
+                <w:szCs w:val="18"/>
               </w:rPr>
               <w:t xml:space="preserve"> </w:t>
             </w:r>
             <w:r>
               <w:rPr>
                 <w:rFonts w:ascii="Times New Roman" w:hAnsi="Times New Roman" w:eastAsia="Times New Roman" w:cs="Times New Roman"/>
-                <w:sz w:val="20"/>
-                <w:szCs w:val="20"/>
+                <w:sz w:val="18"/>
+                <w:szCs w:val="18"/>
               </w:rPr>
               <w:t xml:space="preserve">}}</w:t>
             </w:r>
@@ -1463,6 +1463,19 @@
           <w:p>
             <w:pPr>
               <w:spacing w:before="0" w:beforeAutospacing="off" w:after="0" w:afterAutospacing="off" w:line="360" w:lineRule="auto"/>
+              <w:rPr>
+                <w:rFonts w:ascii="Times New Roman" w:hAnsi="Times New Roman" w:eastAsia="Times New Roman" w:cs="Times New Roman"/>
+                <w:b w:val="0"/>
+                <w:bCs w:val="0"/>
+                <w:i w:val="0"/>
+                <w:iCs w:val="0"/>
+                <w:strike w:val="0"/>
+                <w:dstrike w:val="0"/>
+                <w:color w:val="000000" w:themeColor="text1" w:themeTint="FF" w:themeShade="FF"/>
+                <w:sz w:val="18"/>
+                <w:szCs w:val="18"/>
+                <w:u w:val="none"/>
+              </w:rPr>
             </w:pPr>
             <w:r>
               <w:rPr>
@@ -1474,8 +1487,8 @@
                 <w:strike w:val="0"/>
                 <w:dstrike w:val="0"/>
                 <w:color w:val="000000" w:themeColor="text1" w:themeTint="FF" w:themeShade="FF"/>
-                <w:sz w:val="20"/>
-                <w:szCs w:val="20"/>
+                <w:sz w:val="18"/>
+                <w:szCs w:val="18"/>
                 <w:u w:val="none"/>
               </w:rPr>
               <w:t>Check which violations applies (if any):</w:t>
@@ -1484,6 +1497,19 @@
           <w:p>
             <w:pPr>
               <w:spacing w:before="0" w:beforeAutospacing="off" w:after="0" w:afterAutospacing="off" w:line="360" w:lineRule="auto"/>
+              <w:rPr>
+                <w:rFonts w:ascii="Times New Roman" w:hAnsi="Times New Roman" w:eastAsia="Times New Roman" w:cs="Times New Roman"/>
+                <w:b w:val="0"/>
+                <w:bCs w:val="0"/>
+                <w:i w:val="0"/>
+                <w:iCs w:val="0"/>
+                <w:strike w:val="0"/>
+                <w:dstrike w:val="0"/>
+                <w:color w:val="000000" w:themeColor="text1" w:themeTint="FF" w:themeShade="FF"/>
+                <w:sz w:val="18"/>
+                <w:szCs w:val="18"/>
+                <w:u w:val="none"/>
+              </w:rPr>
             </w:pPr>
             <w:r>
               <w:rPr>
@@ -1495,8 +1521,8 @@
                 <w:strike w:val="0"/>
                 <w:dstrike w:val="0"/>
                 <w:color w:val="000000" w:themeColor="text1" w:themeTint="FF" w:themeShade="FF"/>
-                <w:sz w:val="20"/>
-                <w:szCs w:val="20"/>
+                <w:sz w:val="18"/>
+                <w:szCs w:val="18"/>
                 <w:u w:val="none"/>
               </w:rPr>
               <w:t xml:space="preserve">{{ </w:t>
@@ -1511,8 +1537,8 @@
                 <w:strike w:val="0"/>
                 <w:dstrike w:val="0"/>
                 <w:color w:val="000000" w:themeColor="text1" w:themeTint="FF" w:themeShade="FF"/>
-                <w:sz w:val="20"/>
-                <w:szCs w:val="20"/>
+                <w:sz w:val="18"/>
+                <w:szCs w:val="18"/>
                 <w:u w:val="none"/>
               </w:rPr>
               <w:t>output_checkbox</w:t>
@@ -1527,8 +1553,8 @@
                 <w:strike w:val="0"/>
                 <w:dstrike w:val="0"/>
                 <w:color w:val="000000" w:themeColor="text1" w:themeTint="FF" w:themeShade="FF"/>
-                <w:sz w:val="20"/>
-                <w:szCs w:val="20"/>
+                <w:sz w:val="18"/>
+                <w:szCs w:val="18"/>
                 <w:u w:val="none"/>
               </w:rPr>
               <w:t>(</w:t>
@@ -1543,8 +1569,8 @@
                 <w:strike w:val="0"/>
                 <w:dstrike w:val="0"/>
                 <w:color w:val="000000" w:themeColor="text1" w:themeTint="FF" w:themeShade="FF"/>
-                <w:sz w:val="20"/>
-                <w:szCs w:val="20"/>
+                <w:sz w:val="18"/>
+                <w:szCs w:val="18"/>
                 <w:u w:val="none"/>
               </w:rPr>
               <w:t>violation_breach_contract</w:t>
@@ -1559,8 +1585,8 @@
                 <w:strike w:val="0"/>
                 <w:dstrike w:val="0"/>
                 <w:color w:val="000000" w:themeColor="text1" w:themeTint="FF" w:themeShade="FF"/>
-                <w:sz w:val="20"/>
-                <w:szCs w:val="20"/>
+                <w:sz w:val="18"/>
+                <w:szCs w:val="18"/>
                 <w:u w:val="none"/>
               </w:rPr>
               <w:t>) }</w:t>
@@ -1575,8 +1601,8 @@
                 <w:strike w:val="0"/>
                 <w:dstrike w:val="0"/>
                 <w:color w:val="000000" w:themeColor="text1" w:themeTint="FF" w:themeShade="FF"/>
-                <w:sz w:val="20"/>
-                <w:szCs w:val="20"/>
+                <w:sz w:val="18"/>
+                <w:szCs w:val="18"/>
                 <w:u w:val="none"/>
               </w:rPr>
               <w:t xml:space="preserve">} Breach of contract (for example: lease agreement) </w:t>
@@ -1586,6 +1612,19 @@
             <w:pPr>
               <w:pStyle w:val="Normal"/>
               <w:spacing w:before="0" w:beforeAutospacing="off" w:after="0" w:afterAutospacing="off" w:line="360" w:lineRule="auto"/>
+              <w:rPr>
+                <w:rFonts w:ascii="Times New Roman" w:hAnsi="Times New Roman" w:eastAsia="Times New Roman" w:cs="Times New Roman"/>
+                <w:b w:val="0"/>
+                <w:bCs w:val="0"/>
+                <w:i w:val="0"/>
+                <w:iCs w:val="0"/>
+                <w:strike w:val="0"/>
+                <w:dstrike w:val="0"/>
+                <w:color w:val="000000" w:themeColor="text1" w:themeTint="FF" w:themeShade="FF"/>
+                <w:sz w:val="18"/>
+                <w:szCs w:val="18"/>
+                <w:u w:val="none"/>
+              </w:rPr>
             </w:pPr>
             <w:r>
               <w:rPr>
@@ -1597,8 +1636,8 @@
                 <w:strike w:val="0"/>
                 <w:dstrike w:val="0"/>
                 <w:color w:val="000000" w:themeColor="text1" w:themeTint="FF" w:themeShade="FF"/>
-                <w:sz w:val="20"/>
-                <w:szCs w:val="20"/>
+                <w:sz w:val="18"/>
+                <w:szCs w:val="18"/>
                 <w:u w:val="none"/>
               </w:rPr>
               <w:t xml:space="preserve">{{ </w:t>
@@ -1613,8 +1652,8 @@
                 <w:strike w:val="0"/>
                 <w:dstrike w:val="0"/>
                 <w:color w:val="000000" w:themeColor="text1" w:themeTint="FF" w:themeShade="FF"/>
-                <w:sz w:val="20"/>
-                <w:szCs w:val="20"/>
+                <w:sz w:val="18"/>
+                <w:szCs w:val="18"/>
                 <w:u w:val="none"/>
               </w:rPr>
               <w:t>output_checkbox</w:t>
@@ -1629,8 +1668,8 @@
                 <w:strike w:val="0"/>
                 <w:dstrike w:val="0"/>
                 <w:color w:val="000000" w:themeColor="text1" w:themeTint="FF" w:themeShade="FF"/>
-                <w:sz w:val="20"/>
-                <w:szCs w:val="20"/>
+                <w:sz w:val="18"/>
+                <w:szCs w:val="18"/>
                 <w:u w:val="none"/>
               </w:rPr>
               <w:t>(</w:t>
@@ -1646,8 +1685,8 @@
                 <w:dstrike w:val="0"/>
                 <w:noProof w:val="0"/>
                 <w:color w:val="000000" w:themeColor="text1" w:themeTint="FF" w:themeShade="FF"/>
-                <w:sz w:val="20"/>
-                <w:szCs w:val="20"/>
+                <w:sz w:val="18"/>
+                <w:szCs w:val="18"/>
                 <w:u w:val="none"/>
                 <w:lang w:val="en-GB"/>
               </w:rPr>
@@ -1663,8 +1702,8 @@
                 <w:strike w:val="0"/>
                 <w:dstrike w:val="0"/>
                 <w:color w:val="000000" w:themeColor="text1" w:themeTint="FF" w:themeShade="FF"/>
-                <w:sz w:val="20"/>
-                <w:szCs w:val="20"/>
+                <w:sz w:val="18"/>
+                <w:szCs w:val="18"/>
                 <w:u w:val="none"/>
               </w:rPr>
               <w:t>) }</w:t>
@@ -1679,8 +1718,8 @@
                 <w:strike w:val="0"/>
                 <w:dstrike w:val="0"/>
                 <w:color w:val="000000" w:themeColor="text1" w:themeTint="FF" w:themeShade="FF"/>
-                <w:sz w:val="20"/>
-                <w:szCs w:val="20"/>
+                <w:sz w:val="18"/>
+                <w:szCs w:val="18"/>
                 <w:u w:val="none"/>
               </w:rPr>
               <w:t xml:space="preserve">} Interference with utilities or services (for example: breach of covenant of quiet enjoyment) </w:t>
@@ -1689,6 +1728,19 @@
           <w:p>
             <w:pPr>
               <w:spacing w:before="0" w:beforeAutospacing="off" w:after="0" w:afterAutospacing="off" w:line="360" w:lineRule="auto"/>
+              <w:rPr>
+                <w:rFonts w:ascii="Times New Roman" w:hAnsi="Times New Roman" w:eastAsia="Times New Roman" w:cs="Times New Roman"/>
+                <w:b w:val="0"/>
+                <w:bCs w:val="0"/>
+                <w:i w:val="0"/>
+                <w:iCs w:val="0"/>
+                <w:strike w:val="0"/>
+                <w:dstrike w:val="0"/>
+                <w:color w:val="000000" w:themeColor="text1" w:themeTint="FF" w:themeShade="FF"/>
+                <w:sz w:val="18"/>
+                <w:szCs w:val="18"/>
+                <w:u w:val="none"/>
+              </w:rPr>
             </w:pPr>
             <w:r>
               <w:rPr>
@@ -1700,8 +1752,8 @@
                 <w:strike w:val="0"/>
                 <w:dstrike w:val="0"/>
                 <w:color w:val="000000" w:themeColor="text1" w:themeTint="FF" w:themeShade="FF"/>
-                <w:sz w:val="20"/>
-                <w:szCs w:val="20"/>
+                <w:sz w:val="18"/>
+                <w:szCs w:val="18"/>
                 <w:u w:val="none"/>
               </w:rPr>
               <w:t xml:space="preserve">{{ </w:t>
@@ -1716,8 +1768,8 @@
                 <w:strike w:val="0"/>
                 <w:dstrike w:val="0"/>
                 <w:color w:val="000000" w:themeColor="text1" w:themeTint="FF" w:themeShade="FF"/>
-                <w:sz w:val="20"/>
-                <w:szCs w:val="20"/>
+                <w:sz w:val="18"/>
+                <w:szCs w:val="18"/>
                 <w:u w:val="none"/>
               </w:rPr>
               <w:t>output_checkbox</w:t>
@@ -1732,8 +1784,8 @@
                 <w:strike w:val="0"/>
                 <w:dstrike w:val="0"/>
                 <w:color w:val="000000" w:themeColor="text1" w:themeTint="FF" w:themeShade="FF"/>
-                <w:sz w:val="20"/>
-                <w:szCs w:val="20"/>
+                <w:sz w:val="18"/>
+                <w:szCs w:val="18"/>
                 <w:u w:val="none"/>
               </w:rPr>
               <w:t>(</w:t>
@@ -1748,8 +1800,8 @@
                 <w:strike w:val="0"/>
                 <w:dstrike w:val="0"/>
                 <w:color w:val="000000" w:themeColor="text1" w:themeTint="FF" w:themeShade="FF"/>
-                <w:sz w:val="20"/>
-                <w:szCs w:val="20"/>
+                <w:sz w:val="18"/>
+                <w:szCs w:val="18"/>
                 <w:u w:val="none"/>
               </w:rPr>
               <w:t>violation_bad_conditions</w:t>
@@ -1764,8 +1816,8 @@
                 <w:strike w:val="0"/>
                 <w:dstrike w:val="0"/>
                 <w:color w:val="000000" w:themeColor="text1" w:themeTint="FF" w:themeShade="FF"/>
-                <w:sz w:val="20"/>
-                <w:szCs w:val="20"/>
+                <w:sz w:val="18"/>
+                <w:szCs w:val="18"/>
                 <w:u w:val="none"/>
               </w:rPr>
               <w:t>) }</w:t>
@@ -1780,8 +1832,8 @@
                 <w:strike w:val="0"/>
                 <w:dstrike w:val="0"/>
                 <w:color w:val="000000" w:themeColor="text1" w:themeTint="FF" w:themeShade="FF"/>
-                <w:sz w:val="20"/>
-                <w:szCs w:val="20"/>
+                <w:sz w:val="18"/>
+                <w:szCs w:val="18"/>
                 <w:u w:val="none"/>
               </w:rPr>
               <w:t xml:space="preserve">} Bad conditions in my home (for example: breach of implied warranty of habitability) </w:t>
@@ -1790,6 +1842,19 @@
           <w:p>
             <w:pPr>
               <w:spacing w:before="0" w:beforeAutospacing="off" w:after="0" w:afterAutospacing="off" w:line="360" w:lineRule="auto"/>
+              <w:rPr>
+                <w:rFonts w:ascii="Times New Roman" w:hAnsi="Times New Roman" w:eastAsia="Times New Roman" w:cs="Times New Roman"/>
+                <w:b w:val="0"/>
+                <w:bCs w:val="0"/>
+                <w:i w:val="0"/>
+                <w:iCs w:val="0"/>
+                <w:strike w:val="0"/>
+                <w:dstrike w:val="0"/>
+                <w:color w:val="000000" w:themeColor="text1" w:themeTint="FF" w:themeShade="FF"/>
+                <w:sz w:val="18"/>
+                <w:szCs w:val="18"/>
+                <w:u w:val="none"/>
+              </w:rPr>
             </w:pPr>
             <w:r>
               <w:rPr>
@@ -1801,8 +1866,8 @@
                 <w:strike w:val="0"/>
                 <w:dstrike w:val="0"/>
                 <w:color w:val="000000" w:themeColor="text1" w:themeTint="FF" w:themeShade="FF"/>
-                <w:sz w:val="20"/>
-                <w:szCs w:val="20"/>
+                <w:sz w:val="18"/>
+                <w:szCs w:val="18"/>
                 <w:u w:val="none"/>
               </w:rPr>
               <w:t xml:space="preserve">{{ </w:t>
@@ -1817,8 +1882,8 @@
                 <w:strike w:val="0"/>
                 <w:dstrike w:val="0"/>
                 <w:color w:val="000000" w:themeColor="text1" w:themeTint="FF" w:themeShade="FF"/>
-                <w:sz w:val="20"/>
-                <w:szCs w:val="20"/>
+                <w:sz w:val="18"/>
+                <w:szCs w:val="18"/>
                 <w:u w:val="none"/>
               </w:rPr>
               <w:t>output_checkbox</w:t>
@@ -1833,8 +1898,8 @@
                 <w:strike w:val="0"/>
                 <w:dstrike w:val="0"/>
                 <w:color w:val="000000" w:themeColor="text1" w:themeTint="FF" w:themeShade="FF"/>
-                <w:sz w:val="20"/>
-                <w:szCs w:val="20"/>
+                <w:sz w:val="18"/>
+                <w:szCs w:val="18"/>
                 <w:u w:val="none"/>
               </w:rPr>
               <w:t>(</w:t>
@@ -1849,8 +1914,8 @@
                 <w:strike w:val="0"/>
                 <w:dstrike w:val="0"/>
                 <w:color w:val="000000" w:themeColor="text1" w:themeTint="FF" w:themeShade="FF"/>
-                <w:sz w:val="20"/>
-                <w:szCs w:val="20"/>
+                <w:sz w:val="18"/>
+                <w:szCs w:val="18"/>
                 <w:u w:val="none"/>
               </w:rPr>
               <w:t>other_issues</w:t>
@@ -1865,8 +1930,8 @@
                 <w:strike w:val="0"/>
                 <w:dstrike w:val="0"/>
                 <w:color w:val="000000" w:themeColor="text1" w:themeTint="FF" w:themeShade="FF"/>
-                <w:sz w:val="20"/>
-                <w:szCs w:val="20"/>
+                <w:sz w:val="18"/>
+                <w:szCs w:val="18"/>
                 <w:u w:val="none"/>
               </w:rPr>
               <w:t>) }</w:t>
@@ -1881,8 +1946,8 @@
                 <w:strike w:val="0"/>
                 <w:dstrike w:val="0"/>
                 <w:color w:val="000000" w:themeColor="text1" w:themeTint="FF" w:themeShade="FF"/>
-                <w:sz w:val="20"/>
-                <w:szCs w:val="20"/>
+                <w:sz w:val="18"/>
+                <w:szCs w:val="18"/>
                 <w:u w:val="none"/>
               </w:rPr>
               <w:t xml:space="preserve">} Other: {{ </w:t>
@@ -1897,8 +1962,8 @@
                 <w:strike w:val="0"/>
                 <w:dstrike w:val="0"/>
                 <w:color w:val="000000" w:themeColor="text1" w:themeTint="FF" w:themeShade="FF"/>
-                <w:sz w:val="20"/>
-                <w:szCs w:val="20"/>
+                <w:sz w:val="18"/>
+                <w:szCs w:val="18"/>
                 <w:u w:val="none"/>
               </w:rPr>
               <w:t>other_issues</w:t>
@@ -1913,8 +1978,8 @@
                 <w:strike w:val="0"/>
                 <w:dstrike w:val="0"/>
                 <w:color w:val="000000" w:themeColor="text1" w:themeTint="FF" w:themeShade="FF"/>
-                <w:sz w:val="20"/>
-                <w:szCs w:val="20"/>
+                <w:sz w:val="18"/>
+                <w:szCs w:val="18"/>
                 <w:u w:val="none"/>
               </w:rPr>
               <w:t>_type</w:t>
@@ -1929,8 +1994,8 @@
                 <w:strike w:val="0"/>
                 <w:dstrike w:val="0"/>
                 <w:color w:val="000000" w:themeColor="text1" w:themeTint="FF" w:themeShade="FF"/>
-                <w:sz w:val="20"/>
-                <w:szCs w:val="20"/>
+                <w:sz w:val="18"/>
+                <w:szCs w:val="18"/>
                 <w:u w:val="none"/>
               </w:rPr>
               <w:t xml:space="preserve"> }</w:t>
@@ -1945,8 +2010,8 @@
                 <w:strike w:val="0"/>
                 <w:dstrike w:val="0"/>
                 <w:color w:val="000000" w:themeColor="text1" w:themeTint="FF" w:themeShade="FF"/>
-                <w:sz w:val="20"/>
-                <w:szCs w:val="20"/>
+                <w:sz w:val="18"/>
+                <w:szCs w:val="18"/>
                 <w:u w:val="none"/>
               </w:rPr>
               <w:t>}</w:t>
@@ -1970,6 +2035,21 @@
           <w:p>
             <w:pPr>
               <w:spacing w:before="0" w:beforeAutospacing="off" w:after="0" w:afterAutospacing="off" w:line="360" w:lineRule="auto"/>
+              <w:rPr>
+                <w:rFonts w:ascii="Times New Roman" w:hAnsi="Times New Roman" w:eastAsia="Times New Roman" w:cs="Times New Roman"/>
+                <w:b w:val="0"/>
+                <w:bCs w:val="0"/>
+                <w:i w:val="0"/>
+                <w:iCs w:val="0"/>
+                <w:strike w:val="0"/>
+                <w:dstrike w:val="0"/>
+                <w:noProof w:val="0"/>
+                <w:color w:val="000000" w:themeColor="text1" w:themeTint="FF" w:themeShade="FF"/>
+                <w:sz w:val="18"/>
+                <w:szCs w:val="18"/>
+                <w:u w:val="none"/>
+                <w:lang w:val="en-GB"/>
+              </w:rPr>
             </w:pPr>
             <w:r>
               <w:rPr>
@@ -1982,8 +2062,8 @@
                 <w:dstrike w:val="0"/>
                 <w:noProof w:val="0"/>
                 <w:color w:val="000000" w:themeColor="text1" w:themeTint="FF" w:themeShade="FF"/>
-                <w:sz w:val="20"/>
-                <w:szCs w:val="20"/>
+                <w:sz w:val="18"/>
+                <w:szCs w:val="18"/>
                 <w:u w:val="none"/>
                 <w:lang w:val="en-GB"/>
               </w:rPr>
@@ -1993,6 +2073,21 @@
           <w:p>
             <w:pPr>
               <w:spacing w:before="0" w:beforeAutospacing="off" w:after="0" w:afterAutospacing="off" w:line="360" w:lineRule="auto"/>
+              <w:rPr>
+                <w:rFonts w:ascii="Times New Roman" w:hAnsi="Times New Roman" w:eastAsia="Times New Roman" w:cs="Times New Roman"/>
+                <w:b w:val="0"/>
+                <w:bCs w:val="0"/>
+                <w:i w:val="0"/>
+                <w:iCs w:val="0"/>
+                <w:strike w:val="0"/>
+                <w:dstrike w:val="0"/>
+                <w:noProof w:val="0"/>
+                <w:color w:val="000000" w:themeColor="text1" w:themeTint="FF" w:themeShade="FF"/>
+                <w:sz w:val="18"/>
+                <w:szCs w:val="18"/>
+                <w:u w:val="none"/>
+                <w:lang w:val="en-GB"/>
+              </w:rPr>
             </w:pPr>
             <w:r>
               <w:rPr>
@@ -2005,8 +2100,8 @@
                 <w:dstrike w:val="0"/>
                 <w:noProof w:val="0"/>
                 <w:color w:val="000000" w:themeColor="text1" w:themeTint="FF" w:themeShade="FF"/>
-                <w:sz w:val="20"/>
-                <w:szCs w:val="20"/>
+                <w:sz w:val="18"/>
+                <w:szCs w:val="18"/>
                 <w:u w:val="none"/>
                 <w:lang w:val="en-GB"/>
               </w:rPr>
@@ -2023,8 +2118,8 @@
                 <w:dstrike w:val="0"/>
                 <w:noProof w:val="0"/>
                 <w:color w:val="000000" w:themeColor="text1" w:themeTint="FF" w:themeShade="FF"/>
-                <w:sz w:val="20"/>
-                <w:szCs w:val="20"/>
+                <w:sz w:val="18"/>
+                <w:szCs w:val="18"/>
                 <w:u w:val="none"/>
                 <w:lang w:val="en-GB"/>
               </w:rPr>
@@ -2041,8 +2136,8 @@
                 <w:dstrike w:val="0"/>
                 <w:noProof w:val="0"/>
                 <w:color w:val="000000" w:themeColor="text1" w:themeTint="FF" w:themeShade="FF"/>
-                <w:sz w:val="20"/>
-                <w:szCs w:val="20"/>
+                <w:sz w:val="18"/>
+                <w:szCs w:val="18"/>
                 <w:u w:val="none"/>
                 <w:lang w:val="en-GB"/>
               </w:rPr>
@@ -2059,8 +2154,8 @@
                 <w:dstrike w:val="0"/>
                 <w:noProof w:val="0"/>
                 <w:color w:val="000000" w:themeColor="text1" w:themeTint="FF" w:themeShade="FF"/>
-                <w:sz w:val="20"/>
-                <w:szCs w:val="20"/>
+                <w:sz w:val="18"/>
+                <w:szCs w:val="18"/>
                 <w:u w:val="none"/>
                 <w:lang w:val="en-GB"/>
               </w:rPr>
@@ -2077,8 +2172,8 @@
                 <w:dstrike w:val="0"/>
                 <w:noProof w:val="0"/>
                 <w:color w:val="000000" w:themeColor="text1" w:themeTint="FF" w:themeShade="FF"/>
-                <w:sz w:val="20"/>
-                <w:szCs w:val="20"/>
+                <w:sz w:val="18"/>
+                <w:szCs w:val="18"/>
                 <w:u w:val="none"/>
                 <w:lang w:val="en-GB"/>
               </w:rPr>
@@ -2095,8 +2190,8 @@
                 <w:dstrike w:val="0"/>
                 <w:noProof w:val="0"/>
                 <w:color w:val="000000" w:themeColor="text1" w:themeTint="FF" w:themeShade="FF"/>
-                <w:sz w:val="20"/>
-                <w:szCs w:val="20"/>
+                <w:sz w:val="18"/>
+                <w:szCs w:val="18"/>
                 <w:u w:val="none"/>
                 <w:lang w:val="en-GB"/>
               </w:rPr>
@@ -2106,6 +2201,21 @@
           <w:p>
             <w:pPr>
               <w:spacing w:before="0" w:beforeAutospacing="off" w:after="0" w:afterAutospacing="off" w:line="360" w:lineRule="auto"/>
+              <w:rPr>
+                <w:rFonts w:ascii="Times New Roman" w:hAnsi="Times New Roman" w:eastAsia="Times New Roman" w:cs="Times New Roman"/>
+                <w:b w:val="0"/>
+                <w:bCs w:val="0"/>
+                <w:i w:val="0"/>
+                <w:iCs w:val="0"/>
+                <w:strike w:val="0"/>
+                <w:dstrike w:val="0"/>
+                <w:noProof w:val="0"/>
+                <w:color w:val="000000" w:themeColor="text1" w:themeTint="FF" w:themeShade="FF"/>
+                <w:sz w:val="18"/>
+                <w:szCs w:val="18"/>
+                <w:u w:val="none"/>
+                <w:lang w:val="en-GB"/>
+              </w:rPr>
             </w:pPr>
             <w:r>
               <w:rPr>
@@ -2118,8 +2228,8 @@
                 <w:dstrike w:val="0"/>
                 <w:noProof w:val="0"/>
                 <w:color w:val="000000" w:themeColor="text1" w:themeTint="FF" w:themeShade="FF"/>
-                <w:sz w:val="20"/>
-                <w:szCs w:val="20"/>
+                <w:sz w:val="18"/>
+                <w:szCs w:val="18"/>
                 <w:u w:val="none"/>
                 <w:lang w:val="en-GB"/>
               </w:rPr>
@@ -2136,8 +2246,8 @@
                 <w:dstrike w:val="0"/>
                 <w:noProof w:val="0"/>
                 <w:color w:val="000000" w:themeColor="text1" w:themeTint="FF" w:themeShade="FF"/>
-                <w:sz w:val="20"/>
-                <w:szCs w:val="20"/>
+                <w:sz w:val="18"/>
+                <w:szCs w:val="18"/>
                 <w:u w:val="none"/>
                 <w:lang w:val="en-GB"/>
               </w:rPr>
@@ -2154,8 +2264,8 @@
                 <w:dstrike w:val="0"/>
                 <w:noProof w:val="0"/>
                 <w:color w:val="000000" w:themeColor="text1" w:themeTint="FF" w:themeShade="FF"/>
-                <w:sz w:val="20"/>
-                <w:szCs w:val="20"/>
+                <w:sz w:val="18"/>
+                <w:szCs w:val="18"/>
                 <w:u w:val="none"/>
                 <w:lang w:val="en-GB"/>
               </w:rPr>
@@ -2172,8 +2282,8 @@
                 <w:dstrike w:val="0"/>
                 <w:noProof w:val="0"/>
                 <w:color w:val="000000" w:themeColor="text1" w:themeTint="FF" w:themeShade="FF"/>
-                <w:sz w:val="20"/>
-                <w:szCs w:val="20"/>
+                <w:sz w:val="18"/>
+                <w:szCs w:val="18"/>
                 <w:u w:val="none"/>
                 <w:lang w:val="en-GB"/>
               </w:rPr>
@@ -2190,8 +2300,8 @@
                 <w:dstrike w:val="0"/>
                 <w:noProof w:val="0"/>
                 <w:color w:val="000000" w:themeColor="text1" w:themeTint="FF" w:themeShade="FF"/>
-                <w:sz w:val="20"/>
-                <w:szCs w:val="20"/>
+                <w:sz w:val="18"/>
+                <w:szCs w:val="18"/>
                 <w:u w:val="none"/>
                 <w:lang w:val="en-GB"/>
               </w:rPr>
@@ -2208,8 +2318,8 @@
                 <w:dstrike w:val="0"/>
                 <w:noProof w:val="0"/>
                 <w:color w:val="000000" w:themeColor="text1" w:themeTint="FF" w:themeShade="FF"/>
-                <w:sz w:val="20"/>
-                <w:szCs w:val="20"/>
+                <w:sz w:val="18"/>
+                <w:szCs w:val="18"/>
                 <w:u w:val="none"/>
                 <w:lang w:val="en-GB"/>
               </w:rPr>
@@ -2226,8 +2336,8 @@
                 <w:dstrike w:val="0"/>
                 <w:noProof w:val="0"/>
                 <w:color w:val="000000" w:themeColor="text1" w:themeTint="FF" w:themeShade="FF"/>
-                <w:sz w:val="20"/>
-                <w:szCs w:val="20"/>
+                <w:sz w:val="18"/>
+                <w:szCs w:val="18"/>
                 <w:u w:val="none"/>
                 <w:lang w:val="en-GB"/>
               </w:rPr>
@@ -2244,8 +2354,8 @@
                 <w:dstrike w:val="0"/>
                 <w:noProof w:val="0"/>
                 <w:color w:val="000000" w:themeColor="text1" w:themeTint="FF" w:themeShade="FF"/>
-                <w:sz w:val="20"/>
-                <w:szCs w:val="20"/>
+                <w:sz w:val="18"/>
+                <w:szCs w:val="18"/>
                 <w:u w:val="none"/>
                 <w:lang w:val="en-GB"/>
               </w:rPr>
@@ -2262,8 +2372,8 @@
                 <w:dstrike w:val="0"/>
                 <w:noProof w:val="0"/>
                 <w:color w:val="000000" w:themeColor="text1" w:themeTint="FF" w:themeShade="FF"/>
-                <w:sz w:val="20"/>
-                <w:szCs w:val="20"/>
+                <w:sz w:val="18"/>
+                <w:szCs w:val="18"/>
                 <w:u w:val="none"/>
                 <w:lang w:val="en-GB"/>
               </w:rPr>
@@ -2280,8 +2390,8 @@
                 <w:dstrike w:val="0"/>
                 <w:noProof w:val="0"/>
                 <w:color w:val="000000" w:themeColor="text1" w:themeTint="FF" w:themeShade="FF"/>
-                <w:sz w:val="20"/>
-                <w:szCs w:val="20"/>
+                <w:sz w:val="18"/>
+                <w:szCs w:val="18"/>
                 <w:u w:val="none"/>
                 <w:lang w:val="en-GB"/>
               </w:rPr>
@@ -2298,8 +2408,8 @@
                 <w:dstrike w:val="0"/>
                 <w:noProof w:val="0"/>
                 <w:color w:val="000000" w:themeColor="text1" w:themeTint="FF" w:themeShade="FF"/>
-                <w:sz w:val="20"/>
-                <w:szCs w:val="20"/>
+                <w:sz w:val="18"/>
+                <w:szCs w:val="18"/>
                 <w:u w:val="none"/>
                 <w:lang w:val="en-GB"/>
               </w:rPr>
@@ -2316,8 +2426,8 @@
                 <w:dstrike w:val="0"/>
                 <w:noProof w:val="0"/>
                 <w:color w:val="000000" w:themeColor="text1" w:themeTint="FF" w:themeShade="FF"/>
-                <w:sz w:val="20"/>
-                <w:szCs w:val="20"/>
+                <w:sz w:val="18"/>
+                <w:szCs w:val="18"/>
                 <w:u w:val="none"/>
                 <w:lang w:val="en-GB"/>
               </w:rPr>
@@ -2327,6 +2437,21 @@
           <w:p>
             <w:pPr>
               <w:spacing w:before="0" w:beforeAutospacing="off" w:after="0" w:afterAutospacing="off" w:line="360" w:lineRule="auto"/>
+              <w:rPr>
+                <w:rFonts w:ascii="Times New Roman" w:hAnsi="Times New Roman" w:eastAsia="Times New Roman" w:cs="Times New Roman"/>
+                <w:b w:val="0"/>
+                <w:bCs w:val="0"/>
+                <w:i w:val="0"/>
+                <w:iCs w:val="0"/>
+                <w:strike w:val="0"/>
+                <w:dstrike w:val="0"/>
+                <w:noProof w:val="0"/>
+                <w:color w:val="000000" w:themeColor="text1" w:themeTint="FF" w:themeShade="FF"/>
+                <w:sz w:val="18"/>
+                <w:szCs w:val="18"/>
+                <w:u w:val="none"/>
+                <w:lang w:val="en-GB"/>
+              </w:rPr>
             </w:pPr>
             <w:r>
               <w:rPr>
@@ -2339,8 +2464,8 @@
                 <w:dstrike w:val="0"/>
                 <w:noProof w:val="0"/>
                 <w:color w:val="000000" w:themeColor="text1" w:themeTint="FF" w:themeShade="FF"/>
-                <w:sz w:val="20"/>
-                <w:szCs w:val="20"/>
+                <w:sz w:val="18"/>
+                <w:szCs w:val="18"/>
                 <w:u w:val="none"/>
                 <w:lang w:val="en-GB"/>
               </w:rPr>
@@ -2357,8 +2482,8 @@
                 <w:dstrike w:val="0"/>
                 <w:noProof w:val="0"/>
                 <w:color w:val="000000" w:themeColor="text1" w:themeTint="FF" w:themeShade="FF"/>
-                <w:sz w:val="20"/>
-                <w:szCs w:val="20"/>
+                <w:sz w:val="18"/>
+                <w:szCs w:val="18"/>
                 <w:u w:val="none"/>
                 <w:lang w:val="en-GB"/>
               </w:rPr>
@@ -2375,8 +2500,8 @@
                 <w:dstrike w:val="0"/>
                 <w:noProof w:val="0"/>
                 <w:color w:val="000000" w:themeColor="text1" w:themeTint="FF" w:themeShade="FF"/>
-                <w:sz w:val="20"/>
-                <w:szCs w:val="20"/>
+                <w:sz w:val="18"/>
+                <w:szCs w:val="18"/>
                 <w:u w:val="none"/>
                 <w:lang w:val="en-GB"/>
               </w:rPr>
@@ -2393,8 +2518,8 @@
                 <w:dstrike w:val="0"/>
                 <w:noProof w:val="0"/>
                 <w:color w:val="000000" w:themeColor="text1" w:themeTint="FF" w:themeShade="FF"/>
-                <w:sz w:val="20"/>
-                <w:szCs w:val="20"/>
+                <w:sz w:val="18"/>
+                <w:szCs w:val="18"/>
                 <w:u w:val="none"/>
                 <w:lang w:val="en-GB"/>
               </w:rPr>
@@ -2411,8 +2536,8 @@
                 <w:dstrike w:val="0"/>
                 <w:noProof w:val="0"/>
                 <w:color w:val="000000" w:themeColor="text1" w:themeTint="FF" w:themeShade="FF"/>
-                <w:sz w:val="20"/>
-                <w:szCs w:val="20"/>
+                <w:sz w:val="18"/>
+                <w:szCs w:val="18"/>
                 <w:u w:val="none"/>
                 <w:lang w:val="en-GB"/>
               </w:rPr>
@@ -2429,8 +2554,8 @@
                 <w:dstrike w:val="0"/>
                 <w:noProof w:val="0"/>
                 <w:color w:val="000000" w:themeColor="text1" w:themeTint="FF" w:themeShade="FF"/>
-                <w:sz w:val="20"/>
-                <w:szCs w:val="20"/>
+                <w:sz w:val="18"/>
+                <w:szCs w:val="18"/>
                 <w:u w:val="none"/>
                 <w:lang w:val="en-GB"/>
               </w:rPr>
@@ -2440,6 +2565,21 @@
           <w:p>
             <w:pPr>
               <w:spacing w:before="0" w:beforeAutospacing="off" w:after="0" w:afterAutospacing="off" w:line="360" w:lineRule="auto"/>
+              <w:rPr>
+                <w:rFonts w:ascii="Times New Roman" w:hAnsi="Times New Roman" w:eastAsia="Times New Roman" w:cs="Times New Roman"/>
+                <w:b w:val="0"/>
+                <w:bCs w:val="0"/>
+                <w:i w:val="0"/>
+                <w:iCs w:val="0"/>
+                <w:strike w:val="0"/>
+                <w:dstrike w:val="0"/>
+                <w:noProof w:val="0"/>
+                <w:color w:val="000000" w:themeColor="text1" w:themeTint="FF" w:themeShade="FF"/>
+                <w:sz w:val="18"/>
+                <w:szCs w:val="18"/>
+                <w:u w:val="none"/>
+                <w:lang w:val="en-GB"/>
+              </w:rPr>
             </w:pPr>
             <w:r>
               <w:rPr>
@@ -2452,8 +2592,8 @@
                 <w:dstrike w:val="0"/>
                 <w:noProof w:val="0"/>
                 <w:color w:val="000000" w:themeColor="text1" w:themeTint="FF" w:themeShade="FF"/>
-                <w:sz w:val="20"/>
-                <w:szCs w:val="20"/>
+                <w:sz w:val="18"/>
+                <w:szCs w:val="18"/>
                 <w:u w:val="none"/>
                 <w:lang w:val="en-GB"/>
               </w:rPr>
@@ -2470,8 +2610,8 @@
                 <w:dstrike w:val="0"/>
                 <w:noProof w:val="0"/>
                 <w:color w:val="000000" w:themeColor="text1" w:themeTint="FF" w:themeShade="FF"/>
-                <w:sz w:val="20"/>
-                <w:szCs w:val="20"/>
+                <w:sz w:val="18"/>
+                <w:szCs w:val="18"/>
                 <w:u w:val="none"/>
                 <w:lang w:val="en-GB"/>
               </w:rPr>
@@ -2488,8 +2628,8 @@
                 <w:dstrike w:val="0"/>
                 <w:noProof w:val="0"/>
                 <w:color w:val="000000" w:themeColor="text1" w:themeTint="FF" w:themeShade="FF"/>
-                <w:sz w:val="20"/>
-                <w:szCs w:val="20"/>
+                <w:sz w:val="18"/>
+                <w:szCs w:val="18"/>
                 <w:u w:val="none"/>
                 <w:lang w:val="en-GB"/>
               </w:rPr>
@@ -2506,8 +2646,8 @@
                 <w:dstrike w:val="0"/>
                 <w:noProof w:val="0"/>
                 <w:color w:val="000000" w:themeColor="text1" w:themeTint="FF" w:themeShade="FF"/>
-                <w:sz w:val="20"/>
-                <w:szCs w:val="20"/>
+                <w:sz w:val="18"/>
+                <w:szCs w:val="18"/>
                 <w:u w:val="none"/>
                 <w:lang w:val="en-GB"/>
               </w:rPr>
@@ -2524,8 +2664,8 @@
                 <w:dstrike w:val="0"/>
                 <w:noProof w:val="0"/>
                 <w:color w:val="000000" w:themeColor="text1" w:themeTint="FF" w:themeShade="FF"/>
-                <w:sz w:val="20"/>
-                <w:szCs w:val="20"/>
+                <w:sz w:val="18"/>
+                <w:szCs w:val="18"/>
                 <w:u w:val="none"/>
                 <w:lang w:val="en-GB"/>
               </w:rPr>
@@ -2542,8 +2682,8 @@
                 <w:dstrike w:val="0"/>
                 <w:noProof w:val="0"/>
                 <w:color w:val="000000" w:themeColor="text1" w:themeTint="FF" w:themeShade="FF"/>
-                <w:sz w:val="20"/>
-                <w:szCs w:val="20"/>
+                <w:sz w:val="18"/>
+                <w:szCs w:val="18"/>
                 <w:u w:val="none"/>
                 <w:lang w:val="en-GB"/>
               </w:rPr>
@@ -2553,6 +2693,21 @@
           <w:p>
             <w:pPr>
               <w:spacing w:before="0" w:beforeAutospacing="off" w:after="0" w:afterAutospacing="off" w:line="360" w:lineRule="auto"/>
+              <w:rPr>
+                <w:rFonts w:ascii="Times New Roman" w:hAnsi="Times New Roman" w:eastAsia="Times New Roman" w:cs="Times New Roman"/>
+                <w:b w:val="0"/>
+                <w:bCs w:val="0"/>
+                <w:i w:val="0"/>
+                <w:iCs w:val="0"/>
+                <w:strike w:val="0"/>
+                <w:dstrike w:val="0"/>
+                <w:noProof w:val="0"/>
+                <w:color w:val="000000" w:themeColor="text1" w:themeTint="FF" w:themeShade="FF"/>
+                <w:sz w:val="18"/>
+                <w:szCs w:val="18"/>
+                <w:u w:val="none"/>
+                <w:lang w:val="en-GB"/>
+              </w:rPr>
             </w:pPr>
             <w:r>
               <w:rPr>
@@ -2565,8 +2720,8 @@
                 <w:dstrike w:val="0"/>
                 <w:noProof w:val="0"/>
                 <w:color w:val="000000" w:themeColor="text1" w:themeTint="FF" w:themeShade="FF"/>
-                <w:sz w:val="20"/>
-                <w:szCs w:val="20"/>
+                <w:sz w:val="18"/>
+                <w:szCs w:val="18"/>
                 <w:u w:val="none"/>
                 <w:lang w:val="en-GB"/>
               </w:rPr>
@@ -2583,8 +2738,8 @@
                 <w:dstrike w:val="0"/>
                 <w:noProof w:val="0"/>
                 <w:color w:val="000000" w:themeColor="text1" w:themeTint="FF" w:themeShade="FF"/>
-                <w:sz w:val="20"/>
-                <w:szCs w:val="20"/>
+                <w:sz w:val="18"/>
+                <w:szCs w:val="18"/>
                 <w:u w:val="none"/>
                 <w:lang w:val="en-GB"/>
               </w:rPr>
@@ -2601,8 +2756,8 @@
                 <w:dstrike w:val="0"/>
                 <w:noProof w:val="0"/>
                 <w:color w:val="000000" w:themeColor="text1" w:themeTint="FF" w:themeShade="FF"/>
-                <w:sz w:val="20"/>
-                <w:szCs w:val="20"/>
+                <w:sz w:val="18"/>
+                <w:szCs w:val="18"/>
                 <w:u w:val="none"/>
                 <w:lang w:val="en-GB"/>
               </w:rPr>
@@ -2619,8 +2774,8 @@
                 <w:dstrike w:val="0"/>
                 <w:noProof w:val="0"/>
                 <w:color w:val="000000" w:themeColor="text1" w:themeTint="FF" w:themeShade="FF"/>
-                <w:sz w:val="20"/>
-                <w:szCs w:val="20"/>
+                <w:sz w:val="18"/>
+                <w:szCs w:val="18"/>
                 <w:u w:val="none"/>
                 <w:lang w:val="en-GB"/>
               </w:rPr>
@@ -2637,8 +2792,8 @@
                 <w:dstrike w:val="0"/>
                 <w:noProof w:val="0"/>
                 <w:color w:val="000000" w:themeColor="text1" w:themeTint="FF" w:themeShade="FF"/>
-                <w:sz w:val="20"/>
-                <w:szCs w:val="20"/>
+                <w:sz w:val="18"/>
+                <w:szCs w:val="18"/>
                 <w:u w:val="none"/>
                 <w:lang w:val="en-GB"/>
               </w:rPr>
@@ -2655,8 +2810,8 @@
                 <w:dstrike w:val="0"/>
                 <w:noProof w:val="0"/>
                 <w:color w:val="000000" w:themeColor="text1" w:themeTint="FF" w:themeShade="FF"/>
-                <w:sz w:val="20"/>
-                <w:szCs w:val="20"/>
+                <w:sz w:val="18"/>
+                <w:szCs w:val="18"/>
                 <w:u w:val="none"/>
                 <w:lang w:val="en-GB"/>
               </w:rPr>
@@ -2673,8 +2828,8 @@
                 <w:dstrike w:val="0"/>
                 <w:noProof w:val="0"/>
                 <w:color w:val="000000" w:themeColor="text1" w:themeTint="FF" w:themeShade="FF"/>
-                <w:sz w:val="20"/>
-                <w:szCs w:val="20"/>
+                <w:sz w:val="18"/>
+                <w:szCs w:val="18"/>
                 <w:u w:val="none"/>
                 <w:lang w:val="en-GB"/>
               </w:rPr>
@@ -2691,8 +2846,8 @@
                 <w:dstrike w:val="0"/>
                 <w:noProof w:val="0"/>
                 <w:color w:val="000000" w:themeColor="text1" w:themeTint="FF" w:themeShade="FF"/>
-                <w:sz w:val="20"/>
-                <w:szCs w:val="20"/>
+                <w:sz w:val="18"/>
+                <w:szCs w:val="18"/>
                 <w:u w:val="none"/>
                 <w:lang w:val="en-GB"/>
               </w:rPr>
@@ -2709,8 +2864,8 @@
                 <w:dstrike w:val="0"/>
                 <w:noProof w:val="0"/>
                 <w:color w:val="000000" w:themeColor="text1" w:themeTint="FF" w:themeShade="FF"/>
-                <w:sz w:val="20"/>
-                <w:szCs w:val="20"/>
+                <w:sz w:val="18"/>
+                <w:szCs w:val="18"/>
                 <w:u w:val="none"/>
                 <w:lang w:val="en-GB"/>
               </w:rPr>
@@ -2727,12 +2882,483 @@
                 <w:dstrike w:val="0"/>
                 <w:noProof w:val="0"/>
                 <w:color w:val="000000" w:themeColor="text1" w:themeTint="FF" w:themeShade="FF"/>
-                <w:sz w:val="20"/>
-                <w:szCs w:val="20"/>
+                <w:sz w:val="18"/>
+                <w:szCs w:val="18"/>
                 <w:u w:val="none"/>
                 <w:lang w:val="en-GB"/>
               </w:rPr>
               <w:t>}</w:t>
+            </w:r>
+          </w:p>
+        </w:tc>
+      </w:tr>
+      <w:tr>
+        <w:trPr>
+          <w:trHeight w:val="300"/>
+        </w:trPr>
+        <w:tc>
+          <w:tcPr>
+            <w:tcW w:w="10558" w:type="dxa"/>
+            <w:gridSpan w:val="5"/>
+            <w:tcBorders>
+              <w:bottom w:val="single" w:color="000000" w:themeColor="text1" w:sz="12"/>
+            </w:tcBorders>
+            <w:tcMar/>
+          </w:tcPr>
+          <w:p>
+            <w:pPr>
+              <w:shd w:val="clear" w:color="auto" w:fill="FFFFFF" w:themeFill="background1"/>
+              <w:spacing w:before="0" w:beforeAutospacing="off" w:after="0" w:afterAutospacing="off" w:line="360" w:lineRule="auto"/>
+              <w:rPr>
+                <w:rFonts w:ascii="Times New Roman" w:hAnsi="Times New Roman" w:eastAsia="Times New Roman" w:cs="Times New Roman"/>
+                <w:b w:val="0"/>
+                <w:bCs w:val="0"/>
+                <w:i w:val="0"/>
+                <w:iCs w:val="0"/>
+                <w:caps w:val="0"/>
+                <w:smallCaps w:val="0"/>
+                <w:noProof w:val="0"/>
+                <w:color w:val="000000" w:themeColor="text1" w:themeTint="FF" w:themeShade="FF"/>
+                <w:sz w:val="18"/>
+                <w:szCs w:val="18"/>
+                <w:lang w:val="en-GB"/>
+              </w:rPr>
+            </w:pPr>
+            <w:r>
+              <w:rPr>
+                <w:rFonts w:ascii="Times New Roman" w:hAnsi="Times New Roman" w:eastAsia="Times New Roman" w:cs="Times New Roman"/>
+                <w:b w:val="0"/>
+                <w:bCs w:val="0"/>
+                <w:i w:val="0"/>
+                <w:iCs w:val="0"/>
+                <w:caps w:val="0"/>
+                <w:smallCaps w:val="0"/>
+                <w:noProof w:val="0"/>
+                <w:color w:val="000000" w:themeColor="text1" w:themeTint="FF" w:themeShade="FF"/>
+                <w:sz w:val="18"/>
+                <w:szCs w:val="18"/>
+                <w:lang w:val="en-GB"/>
+              </w:rPr>
+              <w:t>Therefore, under Rule 65 of the Mass. Rules of Civil Procedure, I ask the Court to: (Check all that apply)</w:t>
+            </w:r>
+          </w:p>
+          <w:p>
+            <w:pPr>
+              <w:shd w:val="clear" w:color="auto" w:fill="FFFFFF" w:themeFill="background1"/>
+              <w:spacing w:before="0" w:beforeAutospacing="off" w:after="0" w:afterAutospacing="off" w:line="360" w:lineRule="auto"/>
+              <w:rPr>
+                <w:rFonts w:ascii="Times New Roman" w:hAnsi="Times New Roman" w:eastAsia="Times New Roman" w:cs="Times New Roman"/>
+                <w:b w:val="0"/>
+                <w:bCs w:val="0"/>
+                <w:i w:val="0"/>
+                <w:iCs w:val="0"/>
+                <w:caps w:val="0"/>
+                <w:smallCaps w:val="0"/>
+                <w:noProof w:val="0"/>
+                <w:color w:val="000000" w:themeColor="text1" w:themeTint="FF" w:themeShade="FF"/>
+                <w:sz w:val="18"/>
+                <w:szCs w:val="18"/>
+                <w:lang w:val="en-GB"/>
+              </w:rPr>
+            </w:pPr>
+            <w:r>
+              <w:rPr>
+                <w:rFonts w:ascii="Times New Roman" w:hAnsi="Times New Roman" w:eastAsia="Times New Roman" w:cs="Times New Roman"/>
+                <w:b w:val="0"/>
+                <w:bCs w:val="0"/>
+                <w:i w:val="0"/>
+                <w:iCs w:val="0"/>
+                <w:caps w:val="0"/>
+                <w:smallCaps w:val="0"/>
+                <w:noProof w:val="0"/>
+                <w:color w:val="000000" w:themeColor="text1" w:themeTint="FF" w:themeShade="FF"/>
+                <w:sz w:val="18"/>
+                <w:szCs w:val="18"/>
+                <w:lang w:val="en-GB"/>
+              </w:rPr>
+              <w:t xml:space="preserve">{{ </w:t>
+            </w:r>
+            <w:r>
+              <w:rPr>
+                <w:rFonts w:ascii="Times New Roman" w:hAnsi="Times New Roman" w:eastAsia="Times New Roman" w:cs="Times New Roman"/>
+                <w:b w:val="0"/>
+                <w:bCs w:val="0"/>
+                <w:i w:val="0"/>
+                <w:iCs w:val="0"/>
+                <w:caps w:val="0"/>
+                <w:smallCaps w:val="0"/>
+                <w:noProof w:val="0"/>
+                <w:color w:val="000000" w:themeColor="text1" w:themeTint="FF" w:themeShade="FF"/>
+                <w:sz w:val="18"/>
+                <w:szCs w:val="18"/>
+                <w:lang w:val="en-GB"/>
+              </w:rPr>
+              <w:t>output_checkbox</w:t>
+            </w:r>
+            <w:r>
+              <w:rPr>
+                <w:rFonts w:ascii="Times New Roman" w:hAnsi="Times New Roman" w:eastAsia="Times New Roman" w:cs="Times New Roman"/>
+                <w:b w:val="0"/>
+                <w:bCs w:val="0"/>
+                <w:i w:val="0"/>
+                <w:iCs w:val="0"/>
+                <w:caps w:val="0"/>
+                <w:smallCaps w:val="0"/>
+                <w:noProof w:val="0"/>
+                <w:color w:val="000000" w:themeColor="text1" w:themeTint="FF" w:themeShade="FF"/>
+                <w:sz w:val="18"/>
+                <w:szCs w:val="18"/>
+                <w:lang w:val="en-GB"/>
+              </w:rPr>
+              <w:t>(</w:t>
+            </w:r>
+            <w:r>
+              <w:rPr>
+                <w:rFonts w:ascii="Times New Roman" w:hAnsi="Times New Roman" w:eastAsia="Times New Roman" w:cs="Times New Roman"/>
+                <w:b w:val="0"/>
+                <w:bCs w:val="0"/>
+                <w:i w:val="0"/>
+                <w:iCs w:val="0"/>
+                <w:caps w:val="0"/>
+                <w:smallCaps w:val="0"/>
+                <w:noProof w:val="0"/>
+                <w:color w:val="000000" w:themeColor="text1" w:themeTint="FF" w:themeShade="FF"/>
+                <w:sz w:val="18"/>
+                <w:szCs w:val="18"/>
+                <w:lang w:val="en-GB"/>
+              </w:rPr>
+              <w:t>issue_tro</w:t>
+            </w:r>
+            <w:r>
+              <w:rPr>
+                <w:rFonts w:ascii="Times New Roman" w:hAnsi="Times New Roman" w:eastAsia="Times New Roman" w:cs="Times New Roman"/>
+                <w:b w:val="0"/>
+                <w:bCs w:val="0"/>
+                <w:i w:val="0"/>
+                <w:iCs w:val="0"/>
+                <w:caps w:val="0"/>
+                <w:smallCaps w:val="0"/>
+                <w:noProof w:val="0"/>
+                <w:color w:val="000000" w:themeColor="text1" w:themeTint="FF" w:themeShade="FF"/>
+                <w:sz w:val="18"/>
+                <w:szCs w:val="18"/>
+                <w:lang w:val="en-GB"/>
+              </w:rPr>
+              <w:t xml:space="preserve">) </w:t>
+            </w:r>
+            <w:r>
+              <w:rPr>
+                <w:rFonts w:ascii="Times New Roman" w:hAnsi="Times New Roman" w:eastAsia="Times New Roman" w:cs="Times New Roman"/>
+                <w:b w:val="0"/>
+                <w:bCs w:val="0"/>
+                <w:i w:val="0"/>
+                <w:iCs w:val="0"/>
+                <w:caps w:val="0"/>
+                <w:smallCaps w:val="0"/>
+                <w:noProof w:val="0"/>
+                <w:color w:val="000000" w:themeColor="text1" w:themeTint="FF" w:themeShade="FF"/>
+                <w:sz w:val="18"/>
+                <w:szCs w:val="18"/>
+                <w:lang w:val="en-GB"/>
+              </w:rPr>
+              <w:t xml:space="preserve">}} </w:t>
+            </w:r>
+            <w:r>
+              <w:rPr>
+                <w:rFonts w:ascii="Times New Roman" w:hAnsi="Times New Roman" w:eastAsia="Times New Roman" w:cs="Times New Roman"/>
+                <w:b w:val="0"/>
+                <w:bCs w:val="0"/>
+                <w:i w:val="0"/>
+                <w:iCs w:val="0"/>
+                <w:caps w:val="0"/>
+                <w:smallCaps w:val="0"/>
+                <w:noProof w:val="0"/>
+                <w:color w:val="000000" w:themeColor="text1" w:themeTint="FF" w:themeShade="FF"/>
+                <w:sz w:val="18"/>
+                <w:szCs w:val="18"/>
+                <w:lang w:val="en-GB"/>
+              </w:rPr>
+              <w:t>Issue a Temporary Restraining Order (valid for 10 days only; may be requested without immediate notice to the other side)</w:t>
+            </w:r>
+          </w:p>
+          <w:p>
+            <w:pPr>
+              <w:pStyle w:val="Normal"/>
+              <w:shd w:val="clear" w:color="auto" w:fill="FFFFFF" w:themeFill="background1"/>
+              <w:spacing w:before="0" w:beforeAutospacing="off" w:after="0" w:afterAutospacing="off" w:line="360" w:lineRule="auto"/>
+              <w:rPr>
+                <w:rFonts w:ascii="Times New Roman" w:hAnsi="Times New Roman" w:eastAsia="Times New Roman" w:cs="Times New Roman"/>
+                <w:b w:val="0"/>
+                <w:bCs w:val="0"/>
+                <w:i w:val="0"/>
+                <w:iCs w:val="0"/>
+                <w:caps w:val="0"/>
+                <w:smallCaps w:val="0"/>
+                <w:noProof w:val="0"/>
+                <w:color w:val="000000" w:themeColor="text1" w:themeTint="FF" w:themeShade="FF"/>
+                <w:sz w:val="18"/>
+                <w:szCs w:val="18"/>
+                <w:lang w:val="en-GB"/>
+              </w:rPr>
+            </w:pPr>
+            <w:r>
+              <w:rPr>
+                <w:rFonts w:ascii="Times New Roman" w:hAnsi="Times New Roman" w:eastAsia="Times New Roman" w:cs="Times New Roman"/>
+                <w:b w:val="0"/>
+                <w:bCs w:val="0"/>
+                <w:i w:val="0"/>
+                <w:iCs w:val="0"/>
+                <w:caps w:val="0"/>
+                <w:smallCaps w:val="0"/>
+                <w:noProof w:val="0"/>
+                <w:color w:val="000000" w:themeColor="text1" w:themeTint="FF" w:themeShade="FF"/>
+                <w:sz w:val="18"/>
+                <w:szCs w:val="18"/>
+                <w:lang w:val="en-GB"/>
+              </w:rPr>
+              <w:t xml:space="preserve">{{ </w:t>
+            </w:r>
+            <w:r>
+              <w:rPr>
+                <w:rFonts w:ascii="Times New Roman" w:hAnsi="Times New Roman" w:eastAsia="Times New Roman" w:cs="Times New Roman"/>
+                <w:b w:val="0"/>
+                <w:bCs w:val="0"/>
+                <w:i w:val="0"/>
+                <w:iCs w:val="0"/>
+                <w:caps w:val="0"/>
+                <w:smallCaps w:val="0"/>
+                <w:noProof w:val="0"/>
+                <w:color w:val="000000" w:themeColor="text1" w:themeTint="FF" w:themeShade="FF"/>
+                <w:sz w:val="18"/>
+                <w:szCs w:val="18"/>
+                <w:lang w:val="en-GB"/>
+              </w:rPr>
+              <w:t>output_checkbox</w:t>
+            </w:r>
+            <w:r>
+              <w:rPr>
+                <w:rFonts w:ascii="Times New Roman" w:hAnsi="Times New Roman" w:eastAsia="Times New Roman" w:cs="Times New Roman"/>
+                <w:b w:val="0"/>
+                <w:bCs w:val="0"/>
+                <w:i w:val="0"/>
+                <w:iCs w:val="0"/>
+                <w:caps w:val="0"/>
+                <w:smallCaps w:val="0"/>
+                <w:noProof w:val="0"/>
+                <w:color w:val="000000" w:themeColor="text1" w:themeTint="FF" w:themeShade="FF"/>
+                <w:sz w:val="18"/>
+                <w:szCs w:val="18"/>
+                <w:lang w:val="en-GB"/>
+              </w:rPr>
+              <w:t>(</w:t>
+            </w:r>
+            <w:r>
+              <w:rPr>
+                <w:rFonts w:ascii="Times New Roman" w:hAnsi="Times New Roman" w:eastAsia="Times New Roman" w:cs="Times New Roman"/>
+                <w:b w:val="0"/>
+                <w:bCs w:val="0"/>
+                <w:i w:val="0"/>
+                <w:iCs w:val="0"/>
+                <w:caps w:val="0"/>
+                <w:smallCaps w:val="0"/>
+                <w:noProof w:val="0"/>
+                <w:color w:val="000000" w:themeColor="text1" w:themeTint="FF" w:themeShade="FF"/>
+                <w:sz w:val="18"/>
+                <w:szCs w:val="18"/>
+                <w:lang w:val="en-GB"/>
+              </w:rPr>
+              <w:t>request_pi</w:t>
+            </w:r>
+            <w:r>
+              <w:rPr>
+                <w:rFonts w:ascii="Times New Roman" w:hAnsi="Times New Roman" w:eastAsia="Times New Roman" w:cs="Times New Roman"/>
+                <w:b w:val="0"/>
+                <w:bCs w:val="0"/>
+                <w:i w:val="0"/>
+                <w:iCs w:val="0"/>
+                <w:caps w:val="0"/>
+                <w:smallCaps w:val="0"/>
+                <w:noProof w:val="0"/>
+                <w:color w:val="000000" w:themeColor="text1" w:themeTint="FF" w:themeShade="FF"/>
+                <w:sz w:val="18"/>
+                <w:szCs w:val="18"/>
+                <w:lang w:val="en-GB"/>
+              </w:rPr>
+              <w:t xml:space="preserve">) }} </w:t>
+            </w:r>
+            <w:r>
+              <w:rPr>
+                <w:rFonts w:ascii="Times New Roman" w:hAnsi="Times New Roman" w:eastAsia="Times New Roman" w:cs="Times New Roman"/>
+                <w:b w:val="0"/>
+                <w:bCs w:val="0"/>
+                <w:i w:val="0"/>
+                <w:iCs w:val="0"/>
+                <w:caps w:val="0"/>
+                <w:smallCaps w:val="0"/>
+                <w:noProof w:val="0"/>
+                <w:color w:val="000000" w:themeColor="text1" w:themeTint="FF" w:themeShade="FF"/>
+                <w:sz w:val="18"/>
+                <w:szCs w:val="18"/>
+                <w:lang w:val="en-GB"/>
+              </w:rPr>
+              <w:t xml:space="preserve">Request a Preliminary Injunction (may be issued for longer than 10 days; notice to the other side is </w:t>
+            </w:r>
+            <w:r>
+              <w:rPr>
+                <w:rFonts w:ascii="Times New Roman" w:hAnsi="Times New Roman" w:eastAsia="Times New Roman" w:cs="Times New Roman"/>
+                <w:b w:val="0"/>
+                <w:bCs w:val="0"/>
+                <w:i w:val="0"/>
+                <w:iCs w:val="0"/>
+                <w:caps w:val="0"/>
+                <w:smallCaps w:val="0"/>
+                <w:noProof w:val="0"/>
+                <w:color w:val="000000" w:themeColor="text1" w:themeTint="FF" w:themeShade="FF"/>
+                <w:sz w:val="18"/>
+                <w:szCs w:val="18"/>
+                <w:lang w:val="en-GB"/>
+              </w:rPr>
+              <w:t>required</w:t>
+            </w:r>
+            <w:r>
+              <w:rPr>
+                <w:rFonts w:ascii="Times New Roman" w:hAnsi="Times New Roman" w:eastAsia="Times New Roman" w:cs="Times New Roman"/>
+                <w:b w:val="0"/>
+                <w:bCs w:val="0"/>
+                <w:i w:val="0"/>
+                <w:iCs w:val="0"/>
+                <w:caps w:val="0"/>
+                <w:smallCaps w:val="0"/>
+                <w:noProof w:val="0"/>
+                <w:color w:val="000000" w:themeColor="text1" w:themeTint="FF" w:themeShade="FF"/>
+                <w:sz w:val="18"/>
+                <w:szCs w:val="18"/>
+                <w:lang w:val="en-GB"/>
+              </w:rPr>
+              <w:t>)</w:t>
+            </w:r>
+          </w:p>
+          <w:p>
+            <w:pPr>
+              <w:pStyle w:val="Normal"/>
+              <w:shd w:val="clear" w:color="auto" w:fill="FFFFFF" w:themeFill="background1"/>
+              <w:spacing w:before="0" w:beforeAutospacing="off" w:after="0" w:afterAutospacing="off" w:line="360" w:lineRule="auto"/>
+              <w:rPr>
+                <w:rFonts w:ascii="Times New Roman" w:hAnsi="Times New Roman" w:eastAsia="Times New Roman" w:cs="Times New Roman"/>
+                <w:b w:val="0"/>
+                <w:bCs w:val="0"/>
+                <w:i w:val="0"/>
+                <w:iCs w:val="0"/>
+                <w:caps w:val="0"/>
+                <w:smallCaps w:val="0"/>
+                <w:noProof w:val="0"/>
+                <w:color w:val="000000" w:themeColor="text1" w:themeTint="FF" w:themeShade="FF"/>
+                <w:sz w:val="18"/>
+                <w:szCs w:val="18"/>
+                <w:lang w:val="en-GB"/>
+              </w:rPr>
+            </w:pPr>
+            <w:r>
+              <w:rPr>
+                <w:rFonts w:ascii="Times New Roman" w:hAnsi="Times New Roman" w:eastAsia="Times New Roman" w:cs="Times New Roman"/>
+                <w:b w:val="0"/>
+                <w:bCs w:val="0"/>
+                <w:i w:val="0"/>
+                <w:iCs w:val="0"/>
+                <w:caps w:val="0"/>
+                <w:smallCaps w:val="0"/>
+                <w:noProof w:val="0"/>
+                <w:color w:val="000000" w:themeColor="text1" w:themeTint="FF" w:themeShade="FF"/>
+                <w:sz w:val="18"/>
+                <w:szCs w:val="18"/>
+                <w:lang w:val="en-GB"/>
+              </w:rPr>
+              <w:t xml:space="preserve">{{ </w:t>
+            </w:r>
+            <w:r>
+              <w:rPr>
+                <w:rFonts w:ascii="Times New Roman" w:hAnsi="Times New Roman" w:eastAsia="Times New Roman" w:cs="Times New Roman"/>
+                <w:b w:val="0"/>
+                <w:bCs w:val="0"/>
+                <w:i w:val="0"/>
+                <w:iCs w:val="0"/>
+                <w:caps w:val="0"/>
+                <w:smallCaps w:val="0"/>
+                <w:noProof w:val="0"/>
+                <w:color w:val="000000" w:themeColor="text1" w:themeTint="FF" w:themeShade="FF"/>
+                <w:sz w:val="18"/>
+                <w:szCs w:val="18"/>
+                <w:lang w:val="en-GB"/>
+              </w:rPr>
+              <w:t>output_checkbox</w:t>
+            </w:r>
+            <w:r>
+              <w:rPr>
+                <w:rFonts w:ascii="Times New Roman" w:hAnsi="Times New Roman" w:eastAsia="Times New Roman" w:cs="Times New Roman"/>
+                <w:b w:val="0"/>
+                <w:bCs w:val="0"/>
+                <w:i w:val="0"/>
+                <w:iCs w:val="0"/>
+                <w:caps w:val="0"/>
+                <w:smallCaps w:val="0"/>
+                <w:noProof w:val="0"/>
+                <w:color w:val="000000" w:themeColor="text1" w:themeTint="FF" w:themeShade="FF"/>
+                <w:sz w:val="18"/>
+                <w:szCs w:val="18"/>
+                <w:lang w:val="en-GB"/>
+              </w:rPr>
+              <w:t>(issue_</w:t>
+            </w:r>
+            <w:r>
+              <w:rPr>
+                <w:rFonts w:ascii="Times New Roman" w:hAnsi="Times New Roman" w:eastAsia="Times New Roman" w:cs="Times New Roman"/>
+                <w:b w:val="0"/>
+                <w:bCs w:val="0"/>
+                <w:i w:val="0"/>
+                <w:iCs w:val="0"/>
+                <w:caps w:val="0"/>
+                <w:smallCaps w:val="0"/>
+                <w:noProof w:val="0"/>
+                <w:color w:val="000000" w:themeColor="text1" w:themeTint="FF" w:themeShade="FF"/>
+                <w:sz w:val="18"/>
+                <w:szCs w:val="18"/>
+                <w:lang w:val="en-GB"/>
+              </w:rPr>
+              <w:t>son</w:t>
+            </w:r>
+            <w:r>
+              <w:rPr>
+                <w:rFonts w:ascii="Times New Roman" w:hAnsi="Times New Roman" w:eastAsia="Times New Roman" w:cs="Times New Roman"/>
+                <w:b w:val="0"/>
+                <w:bCs w:val="0"/>
+                <w:i w:val="0"/>
+                <w:iCs w:val="0"/>
+                <w:caps w:val="0"/>
+                <w:smallCaps w:val="0"/>
+                <w:noProof w:val="0"/>
+                <w:color w:val="000000" w:themeColor="text1" w:themeTint="FF" w:themeShade="FF"/>
+                <w:sz w:val="18"/>
+                <w:szCs w:val="18"/>
+                <w:lang w:val="en-GB"/>
+              </w:rPr>
+              <w:t xml:space="preserve">) }} </w:t>
+            </w:r>
+            <w:r>
+              <w:rPr>
+                <w:rFonts w:ascii="Times New Roman" w:hAnsi="Times New Roman" w:eastAsia="Times New Roman" w:cs="Times New Roman"/>
+                <w:b w:val="0"/>
+                <w:bCs w:val="0"/>
+                <w:i w:val="0"/>
+                <w:iCs w:val="0"/>
+                <w:caps w:val="0"/>
+                <w:smallCaps w:val="0"/>
+                <w:noProof w:val="0"/>
+                <w:color w:val="000000" w:themeColor="text1" w:themeTint="FF" w:themeShade="FF"/>
+                <w:sz w:val="18"/>
+                <w:szCs w:val="18"/>
+                <w:lang w:val="en-GB"/>
+              </w:rPr>
+              <w:t>Issue a Short Order of Notice (a shortened notice period to the other side so the Court can hear this request)</w:t>
             </w:r>
           </w:p>
         </w:tc>
@@ -2759,8 +3385,8 @@
               <w:rPr>
                 <w:rFonts w:ascii="Times New Roman" w:hAnsi="Times New Roman" w:eastAsia="Times New Roman" w:cs="Times New Roman"/>
                 <w:noProof w:val="0"/>
-                <w:sz w:val="20"/>
-                <w:szCs w:val="20"/>
+                <w:sz w:val="18"/>
+                <w:szCs w:val="18"/>
                 <w:lang w:val="en-GB"/>
               </w:rPr>
             </w:pPr>
@@ -2775,8 +3401,8 @@
                 <w:smallCaps w:val="0"/>
                 <w:noProof w:val="0"/>
                 <w:color w:val="000000" w:themeColor="text1" w:themeTint="FF" w:themeShade="FF"/>
-                <w:sz w:val="20"/>
-                <w:szCs w:val="20"/>
+                <w:sz w:val="18"/>
+                <w:szCs w:val="18"/>
                 <w:lang w:val="en-GB"/>
               </w:rPr>
               <w:t xml:space="preserve">I have personal knowledge of </w:t>
@@ -2792,8 +3418,8 @@
                 <w:smallCaps w:val="0"/>
                 <w:noProof w:val="0"/>
                 <w:color w:val="000000" w:themeColor="text1" w:themeTint="FF" w:themeShade="FF"/>
-                <w:sz w:val="20"/>
-                <w:szCs w:val="20"/>
+                <w:sz w:val="18"/>
+                <w:szCs w:val="18"/>
                 <w:lang w:val="en-GB"/>
               </w:rPr>
               <w:t>all of</w:t>
@@ -2809,8 +3435,8 @@
                 <w:smallCaps w:val="0"/>
                 <w:noProof w:val="0"/>
                 <w:color w:val="000000" w:themeColor="text1" w:themeTint="FF" w:themeShade="FF"/>
-                <w:sz w:val="20"/>
-                <w:szCs w:val="20"/>
+                <w:sz w:val="18"/>
+                <w:szCs w:val="18"/>
                 <w:lang w:val="en-GB"/>
               </w:rPr>
               <w:t xml:space="preserve"> the facts </w:t>
@@ -2826,8 +3452,8 @@
                 <w:smallCaps w:val="0"/>
                 <w:noProof w:val="0"/>
                 <w:color w:val="000000" w:themeColor="text1" w:themeTint="FF" w:themeShade="FF"/>
-                <w:sz w:val="20"/>
-                <w:szCs w:val="20"/>
+                <w:sz w:val="18"/>
+                <w:szCs w:val="18"/>
                 <w:lang w:val="en-GB"/>
               </w:rPr>
               <w:t>stated</w:t>
@@ -2843,8 +3469,8 @@
                 <w:smallCaps w:val="0"/>
                 <w:noProof w:val="0"/>
                 <w:color w:val="000000" w:themeColor="text1" w:themeTint="FF" w:themeShade="FF"/>
-                <w:sz w:val="20"/>
-                <w:szCs w:val="20"/>
+                <w:sz w:val="18"/>
+                <w:szCs w:val="18"/>
                 <w:lang w:val="en-GB"/>
               </w:rPr>
               <w:t xml:space="preserve"> above and hereby swear under the penalties of perjury those facts are true and </w:t>
@@ -2860,8 +3486,8 @@
                 <w:smallCaps w:val="0"/>
                 <w:noProof w:val="0"/>
                 <w:color w:val="000000" w:themeColor="text1" w:themeTint="FF" w:themeShade="FF"/>
-                <w:sz w:val="20"/>
-                <w:szCs w:val="20"/>
+                <w:sz w:val="18"/>
+                <w:szCs w:val="18"/>
                 <w:lang w:val="en-GB"/>
               </w:rPr>
               <w:t>accurate</w:t>
@@ -2877,8 +3503,8 @@
                 <w:smallCaps w:val="0"/>
                 <w:noProof w:val="0"/>
                 <w:color w:val="000000" w:themeColor="text1" w:themeTint="FF" w:themeShade="FF"/>
-                <w:sz w:val="20"/>
-                <w:szCs w:val="20"/>
+                <w:sz w:val="18"/>
+                <w:szCs w:val="18"/>
                 <w:lang w:val="en-GB"/>
               </w:rPr>
               <w:t>:</w:t>
@@ -2908,15 +3534,15 @@
               <w:spacing w:line="360" w:lineRule="auto"/>
               <w:rPr>
                 <w:rFonts w:ascii="Times New Roman" w:hAnsi="Times New Roman" w:eastAsia="Times New Roman" w:cs="Times New Roman"/>
-                <w:sz w:val="20"/>
-                <w:szCs w:val="20"/>
+                <w:sz w:val="18"/>
+                <w:szCs w:val="18"/>
               </w:rPr>
             </w:pPr>
             <w:r>
               <w:rPr>
                 <w:rFonts w:ascii="Times New Roman" w:hAnsi="Times New Roman" w:eastAsia="Times New Roman" w:cs="Times New Roman"/>
-                <w:sz w:val="20"/>
-                <w:szCs w:val="20"/>
+                <w:sz w:val="18"/>
+                <w:szCs w:val="18"/>
               </w:rPr>
               <w:t xml:space="preserve">Plaintiff's Signature: </w:t>
             </w:r>
@@ -2927,8 +3553,8 @@
               <w:spacing w:line="360" w:lineRule="auto"/>
               <w:rPr>
                 <w:rFonts w:ascii="Times New Roman" w:hAnsi="Times New Roman" w:eastAsia="Times New Roman" w:cs="Times New Roman"/>
-                <w:sz w:val="20"/>
-                <w:szCs w:val="20"/>
+                <w:sz w:val="18"/>
+                <w:szCs w:val="18"/>
               </w:rPr>
             </w:pPr>
           </w:p>
@@ -2940,8 +3566,8 @@
                 <w:rFonts w:ascii="Times New Roman" w:hAnsi="Times New Roman" w:eastAsia="Times New Roman" w:cs="Times New Roman"/>
                 <w:b w:val="1"/>
                 <w:bCs w:val="1"/>
-                <w:sz w:val="20"/>
-                <w:szCs w:val="20"/>
+                <w:sz w:val="18"/>
+                <w:szCs w:val="18"/>
               </w:rPr>
             </w:pPr>
             <w:r>
@@ -2949,8 +3575,8 @@
                 <w:rFonts w:ascii="Times New Roman" w:hAnsi="Times New Roman" w:eastAsia="Times New Roman" w:cs="Times New Roman"/>
                 <w:b w:val="1"/>
                 <w:bCs w:val="1"/>
-                <w:sz w:val="20"/>
-                <w:szCs w:val="20"/>
+                <w:sz w:val="18"/>
+                <w:szCs w:val="18"/>
               </w:rPr>
               <w:t xml:space="preserve">{{ </w:t>
             </w:r>
@@ -2959,8 +3585,8 @@
                 <w:rFonts w:ascii="Times New Roman" w:hAnsi="Times New Roman" w:eastAsia="Times New Roman" w:cs="Times New Roman"/>
                 <w:b w:val="0"/>
                 <w:bCs w:val="0"/>
-                <w:sz w:val="20"/>
-                <w:szCs w:val="20"/>
+                <w:sz w:val="18"/>
+                <w:szCs w:val="18"/>
                 <w:shd w:val="clear" w:color="auto" w:fill="C7E1DD"/>
               </w:rPr>
               <w:t>plaintiffs[0].signature</w:t>
@@ -2970,8 +3596,8 @@
                 <w:rFonts w:ascii="Times New Roman" w:hAnsi="Times New Roman" w:eastAsia="Times New Roman" w:cs="Times New Roman"/>
                 <w:b w:val="1"/>
                 <w:bCs w:val="1"/>
-                <w:sz w:val="20"/>
-                <w:szCs w:val="20"/>
+                <w:sz w:val="18"/>
+                <w:szCs w:val="18"/>
               </w:rPr>
               <w:t xml:space="preserve"> }}</w:t>
             </w:r>
@@ -2995,31 +3621,31 @@
               <w:spacing w:line="360" w:lineRule="auto"/>
               <w:rPr>
                 <w:rFonts w:ascii="Times New Roman" w:hAnsi="Times New Roman" w:eastAsia="Times New Roman" w:cs="Times New Roman"/>
-                <w:sz w:val="20"/>
-                <w:szCs w:val="20"/>
+                <w:sz w:val="18"/>
+                <w:szCs w:val="18"/>
               </w:rPr>
             </w:pPr>
             <w:r>
               <w:rPr>
                 <w:rFonts w:ascii="Times New Roman" w:hAnsi="Times New Roman" w:eastAsia="Times New Roman" w:cs="Times New Roman"/>
-                <w:sz w:val="20"/>
-                <w:szCs w:val="20"/>
+                <w:sz w:val="18"/>
+                <w:szCs w:val="18"/>
               </w:rPr>
               <w:t xml:space="preserve">Date: </w:t>
             </w:r>
             <w:r>
               <w:rPr>
                 <w:rFonts w:ascii="Times New Roman" w:hAnsi="Times New Roman" w:eastAsia="Times New Roman" w:cs="Times New Roman"/>
-                <w:sz w:val="20"/>
-                <w:szCs w:val="20"/>
+                <w:sz w:val="18"/>
+                <w:szCs w:val="18"/>
               </w:rPr>
               <w:t xml:space="preserve">{{ </w:t>
             </w:r>
             <w:r>
               <w:rPr>
                 <w:rFonts w:ascii="Times New Roman" w:hAnsi="Times New Roman" w:eastAsia="Times New Roman" w:cs="Times New Roman"/>
-                <w:sz w:val="20"/>
-                <w:szCs w:val="20"/>
+                <w:sz w:val="18"/>
+                <w:szCs w:val="18"/>
                 <w:shd w:val="clear" w:color="auto" w:fill="C7E1DD"/>
               </w:rPr>
               <w:t>signature_date</w:t>
@@ -3027,8 +3653,8 @@
             <w:r>
               <w:rPr>
                 <w:rFonts w:ascii="Times New Roman" w:hAnsi="Times New Roman" w:eastAsia="Times New Roman" w:cs="Times New Roman"/>
-                <w:sz w:val="20"/>
-                <w:szCs w:val="20"/>
+                <w:sz w:val="18"/>
+                <w:szCs w:val="18"/>
               </w:rPr>
               <w:t xml:space="preserve"> }}</w:t>
             </w:r>
@@ -3039,15 +3665,15 @@
               <w:spacing w:line="360" w:lineRule="auto"/>
               <w:rPr>
                 <w:rFonts w:ascii="Times New Roman" w:hAnsi="Times New Roman" w:eastAsia="Times New Roman" w:cs="Times New Roman"/>
-                <w:sz w:val="20"/>
-                <w:szCs w:val="20"/>
+                <w:sz w:val="18"/>
+                <w:szCs w:val="18"/>
               </w:rPr>
             </w:pPr>
             <w:r>
               <w:rPr>
                 <w:rFonts w:ascii="Times New Roman" w:hAnsi="Times New Roman" w:eastAsia="Times New Roman" w:cs="Times New Roman"/>
-                <w:sz w:val="20"/>
-                <w:szCs w:val="20"/>
+                <w:sz w:val="18"/>
+                <w:szCs w:val="18"/>
               </w:rPr>
               <w:t xml:space="preserve">            </w:t>
             </w:r>
@@ -3057,8 +3683,8 @@
               <w:pStyle w:val="Normal"/>
               <w:rPr>
                 <w:rFonts w:ascii="Times New Roman" w:hAnsi="Times New Roman" w:eastAsia="Times New Roman" w:cs="Times New Roman"/>
-                <w:sz w:val="20"/>
-                <w:szCs w:val="20"/>
+                <w:sz w:val="18"/>
+                <w:szCs w:val="18"/>
               </w:rPr>
             </w:pPr>
           </w:p>

</xml_diff>

<commit_message>
Added a question that fills in the field for if there is an eviction case and added a note at the bottom of screen as a warning
</commit_message>
<xml_diff>
--- a/docassemble/MAHousingTRO/data/templates/verified_complaint_and_request_for.docx
+++ b/docassemble/MAHousingTRO/data/templates/verified_complaint_and_request_for.docx
@@ -50,7 +50,7 @@
             </w:pPr>
             <w:r>
               <w:drawing>
-                <wp:inline xmlns:wp14="http://schemas.microsoft.com/office/word/2010/wordprocessingDrawing" wp14:editId="70A9D6AE" wp14:anchorId="1B5073FF">
+                <wp:inline xmlns:wp14="http://schemas.microsoft.com/office/word/2010/wordprocessingDrawing" wp14:editId="21FC4E78" wp14:anchorId="1B5073FF">
                   <wp:extent cx="711777" cy="711777"/>
                   <wp:effectExtent l="0" t="0" r="0" b="0"/>
                   <wp:docPr id="860523738" name="drawing"/>
@@ -438,151 +438,7 @@
                 <w:u w:val="none"/>
                 <w:lang w:val="en-GB"/>
               </w:rPr>
-              <w:t>DO YOU HAVE A SUMMARY PROCESS (EVICTION CASE)</w:t>
-            </w:r>
-            <w:r>
-              <w:rPr>
-                <w:rFonts w:ascii="Times New Roman" w:hAnsi="Times New Roman" w:eastAsia="Times New Roman" w:cs="Times New Roman"/>
-                <w:b w:val="0"/>
-                <w:bCs w:val="0"/>
-                <w:i w:val="0"/>
-                <w:iCs w:val="0"/>
-                <w:strike w:val="0"/>
-                <w:dstrike w:val="0"/>
-                <w:noProof w:val="0"/>
-                <w:color w:val="000000" w:themeColor="text1" w:themeTint="FF" w:themeShade="FF"/>
-                <w:sz w:val="18"/>
-                <w:szCs w:val="18"/>
-                <w:u w:val="none"/>
-                <w:lang w:val="en-GB"/>
-              </w:rPr>
-              <w:t xml:space="preserve"> {{ </w:t>
-            </w:r>
-            <w:r>
-              <w:rPr>
-                <w:rFonts w:ascii="Times New Roman" w:hAnsi="Times New Roman" w:eastAsia="Times New Roman" w:cs="Times New Roman"/>
-                <w:b w:val="0"/>
-                <w:bCs w:val="0"/>
-                <w:i w:val="0"/>
-                <w:iCs w:val="0"/>
-                <w:strike w:val="0"/>
-                <w:dstrike w:val="0"/>
-                <w:noProof w:val="0"/>
-                <w:color w:val="000000" w:themeColor="text1" w:themeTint="FF" w:themeShade="FF"/>
-                <w:sz w:val="18"/>
-                <w:szCs w:val="18"/>
-                <w:u w:val="none"/>
-                <w:lang w:val="en-GB"/>
-              </w:rPr>
-              <w:t>output_checkbox</w:t>
-            </w:r>
-            <w:r>
-              <w:rPr>
-                <w:rFonts w:ascii="Times New Roman" w:hAnsi="Times New Roman" w:eastAsia="Times New Roman" w:cs="Times New Roman"/>
-                <w:b w:val="0"/>
-                <w:bCs w:val="0"/>
-                <w:i w:val="0"/>
-                <w:iCs w:val="0"/>
-                <w:strike w:val="0"/>
-                <w:dstrike w:val="0"/>
-                <w:noProof w:val="0"/>
-                <w:color w:val="000000" w:themeColor="text1" w:themeTint="FF" w:themeShade="FF"/>
-                <w:sz w:val="18"/>
-                <w:szCs w:val="18"/>
-                <w:u w:val="none"/>
-                <w:lang w:val="en-GB"/>
-              </w:rPr>
-              <w:t>(</w:t>
-            </w:r>
-            <w:r>
-              <w:rPr>
-                <w:rFonts w:ascii="Times New Roman" w:hAnsi="Times New Roman" w:eastAsia="Times New Roman" w:cs="Times New Roman"/>
-                <w:b w:val="0"/>
-                <w:bCs w:val="0"/>
-                <w:i w:val="0"/>
-                <w:iCs w:val="0"/>
-                <w:strike w:val="0"/>
-                <w:dstrike w:val="0"/>
-                <w:noProof w:val="0"/>
-                <w:color w:val="000000" w:themeColor="text1" w:themeTint="FF" w:themeShade="FF"/>
-                <w:sz w:val="18"/>
-                <w:szCs w:val="18"/>
-                <w:u w:val="none"/>
-                <w:lang w:val="en-GB"/>
-              </w:rPr>
-              <w:t>eviction_case</w:t>
-            </w:r>
-            <w:r>
-              <w:rPr>
-                <w:rFonts w:ascii="Times New Roman" w:hAnsi="Times New Roman" w:eastAsia="Times New Roman" w:cs="Times New Roman"/>
-                <w:b w:val="0"/>
-                <w:bCs w:val="0"/>
-                <w:i w:val="0"/>
-                <w:iCs w:val="0"/>
-                <w:strike w:val="0"/>
-                <w:dstrike w:val="0"/>
-                <w:noProof w:val="0"/>
-                <w:color w:val="000000" w:themeColor="text1" w:themeTint="FF" w:themeShade="FF"/>
-                <w:sz w:val="18"/>
-                <w:szCs w:val="18"/>
-                <w:u w:val="none"/>
-                <w:lang w:val="en-GB"/>
-              </w:rPr>
-              <w:t>_yes</w:t>
-            </w:r>
-            <w:r>
-              <w:rPr>
-                <w:rFonts w:ascii="Times New Roman" w:hAnsi="Times New Roman" w:eastAsia="Times New Roman" w:cs="Times New Roman"/>
-                <w:b w:val="0"/>
-                <w:bCs w:val="0"/>
-                <w:i w:val="0"/>
-                <w:iCs w:val="0"/>
-                <w:strike w:val="0"/>
-                <w:dstrike w:val="0"/>
-                <w:noProof w:val="0"/>
-                <w:color w:val="000000" w:themeColor="text1" w:themeTint="FF" w:themeShade="FF"/>
-                <w:sz w:val="18"/>
-                <w:szCs w:val="18"/>
-                <w:u w:val="none"/>
-                <w:lang w:val="en-GB"/>
-              </w:rPr>
-              <w:t>) }</w:t>
-            </w:r>
-            <w:r>
-              <w:rPr>
-                <w:rFonts w:ascii="Times New Roman" w:hAnsi="Times New Roman" w:eastAsia="Times New Roman" w:cs="Times New Roman"/>
-                <w:b w:val="0"/>
-                <w:bCs w:val="0"/>
-                <w:i w:val="0"/>
-                <w:iCs w:val="0"/>
-                <w:strike w:val="0"/>
-                <w:dstrike w:val="0"/>
-                <w:noProof w:val="0"/>
-                <w:color w:val="000000" w:themeColor="text1" w:themeTint="FF" w:themeShade="FF"/>
-                <w:sz w:val="18"/>
-                <w:szCs w:val="18"/>
-                <w:u w:val="none"/>
-                <w:lang w:val="en-GB"/>
-              </w:rPr>
-              <w:t>}</w:t>
-            </w:r>
-            <w:r>
-              <w:rPr>
-                <w:rFonts w:ascii="Times New Roman" w:hAnsi="Times New Roman" w:eastAsia="Times New Roman" w:cs="Times New Roman"/>
-                <w:b w:val="0"/>
-                <w:bCs w:val="0"/>
-                <w:i w:val="0"/>
-                <w:iCs w:val="0"/>
-                <w:strike w:val="0"/>
-                <w:dstrike w:val="0"/>
-                <w:noProof w:val="0"/>
-                <w:color w:val="000000" w:themeColor="text1" w:themeTint="FF" w:themeShade="FF"/>
-                <w:sz w:val="18"/>
-                <w:szCs w:val="18"/>
-                <w:u w:val="none"/>
-                <w:lang w:val="en-GB"/>
-              </w:rPr>
-              <w:t xml:space="preserve"> </w:t>
+              <w:t xml:space="preserve">DO </w:t>
             </w:r>
             <w:r>
               <w:rPr>
@@ -600,6 +456,222 @@
                 <w:u w:val="none"/>
                 <w:lang w:val="en-GB"/>
               </w:rPr>
+              <w:t>YOU HAVE A SUMM</w:t>
+            </w:r>
+            <w:r>
+              <w:rPr>
+                <w:rFonts w:ascii="Times New Roman" w:hAnsi="Times New Roman" w:eastAsia="Times New Roman" w:cs="Times New Roman"/>
+                <w:b w:val="1"/>
+                <w:bCs w:val="1"/>
+                <w:i w:val="0"/>
+                <w:iCs w:val="0"/>
+                <w:strike w:val="0"/>
+                <w:dstrike w:val="0"/>
+                <w:noProof w:val="0"/>
+                <w:color w:val="000000" w:themeColor="text1" w:themeTint="FF" w:themeShade="FF"/>
+                <w:sz w:val="18"/>
+                <w:szCs w:val="18"/>
+                <w:u w:val="none"/>
+                <w:lang w:val="en-GB"/>
+              </w:rPr>
+              <w:t>A</w:t>
+            </w:r>
+            <w:r>
+              <w:rPr>
+                <w:rFonts w:ascii="Times New Roman" w:hAnsi="Times New Roman" w:eastAsia="Times New Roman" w:cs="Times New Roman"/>
+                <w:b w:val="1"/>
+                <w:bCs w:val="1"/>
+                <w:i w:val="0"/>
+                <w:iCs w:val="0"/>
+                <w:strike w:val="0"/>
+                <w:dstrike w:val="0"/>
+                <w:noProof w:val="0"/>
+                <w:color w:val="000000" w:themeColor="text1" w:themeTint="FF" w:themeShade="FF"/>
+                <w:sz w:val="18"/>
+                <w:szCs w:val="18"/>
+                <w:u w:val="none"/>
+                <w:lang w:val="en-GB"/>
+              </w:rPr>
+              <w:t>RY PROCESS (E</w:t>
+            </w:r>
+            <w:r>
+              <w:rPr>
+                <w:rFonts w:ascii="Times New Roman" w:hAnsi="Times New Roman" w:eastAsia="Times New Roman" w:cs="Times New Roman"/>
+                <w:b w:val="1"/>
+                <w:bCs w:val="1"/>
+                <w:i w:val="0"/>
+                <w:iCs w:val="0"/>
+                <w:strike w:val="0"/>
+                <w:dstrike w:val="0"/>
+                <w:noProof w:val="0"/>
+                <w:color w:val="000000" w:themeColor="text1" w:themeTint="FF" w:themeShade="FF"/>
+                <w:sz w:val="18"/>
+                <w:szCs w:val="18"/>
+                <w:u w:val="none"/>
+                <w:lang w:val="en-GB"/>
+              </w:rPr>
+              <w:t>VIC</w:t>
+            </w:r>
+            <w:r>
+              <w:rPr>
+                <w:rFonts w:ascii="Times New Roman" w:hAnsi="Times New Roman" w:eastAsia="Times New Roman" w:cs="Times New Roman"/>
+                <w:b w:val="1"/>
+                <w:bCs w:val="1"/>
+                <w:i w:val="0"/>
+                <w:iCs w:val="0"/>
+                <w:strike w:val="0"/>
+                <w:dstrike w:val="0"/>
+                <w:noProof w:val="0"/>
+                <w:color w:val="000000" w:themeColor="text1" w:themeTint="FF" w:themeShade="FF"/>
+                <w:sz w:val="18"/>
+                <w:szCs w:val="18"/>
+                <w:u w:val="none"/>
+                <w:lang w:val="en-GB"/>
+              </w:rPr>
+              <w:t>TION CASE)</w:t>
+            </w:r>
+            <w:r>
+              <w:rPr>
+                <w:rFonts w:ascii="Times New Roman" w:hAnsi="Times New Roman" w:eastAsia="Times New Roman" w:cs="Times New Roman"/>
+                <w:b w:val="0"/>
+                <w:bCs w:val="0"/>
+                <w:i w:val="0"/>
+                <w:iCs w:val="0"/>
+                <w:strike w:val="0"/>
+                <w:dstrike w:val="0"/>
+                <w:noProof w:val="0"/>
+                <w:color w:val="000000" w:themeColor="text1" w:themeTint="FF" w:themeShade="FF"/>
+                <w:sz w:val="18"/>
+                <w:szCs w:val="18"/>
+                <w:u w:val="none"/>
+                <w:lang w:val="en-GB"/>
+              </w:rPr>
+              <w:t xml:space="preserve"> </w:t>
+            </w:r>
+            <w:r>
+              <w:rPr>
+                <w:rFonts w:ascii="Times New Roman" w:hAnsi="Times New Roman" w:eastAsia="Times New Roman" w:cs="Times New Roman"/>
+                <w:b w:val="0"/>
+                <w:bCs w:val="0"/>
+                <w:i w:val="0"/>
+                <w:iCs w:val="0"/>
+                <w:strike w:val="0"/>
+                <w:dstrike w:val="0"/>
+                <w:noProof w:val="0"/>
+                <w:color w:val="000000" w:themeColor="text1" w:themeTint="FF" w:themeShade="FF"/>
+                <w:sz w:val="18"/>
+                <w:szCs w:val="18"/>
+                <w:u w:val="none"/>
+                <w:lang w:val="en-GB"/>
+              </w:rPr>
+              <w:t xml:space="preserve">{{ </w:t>
+            </w:r>
+            <w:r>
+              <w:rPr>
+                <w:rFonts w:ascii="Times New Roman" w:hAnsi="Times New Roman" w:eastAsia="Times New Roman" w:cs="Times New Roman"/>
+                <w:b w:val="0"/>
+                <w:bCs w:val="0"/>
+                <w:i w:val="0"/>
+                <w:iCs w:val="0"/>
+                <w:strike w:val="0"/>
+                <w:dstrike w:val="0"/>
+                <w:noProof w:val="0"/>
+                <w:color w:val="000000" w:themeColor="text1" w:themeTint="FF" w:themeShade="FF"/>
+                <w:sz w:val="18"/>
+                <w:szCs w:val="18"/>
+                <w:u w:val="none"/>
+                <w:lang w:val="en-GB"/>
+              </w:rPr>
+              <w:t>output_checkbox</w:t>
+            </w:r>
+            <w:r>
+              <w:rPr>
+                <w:rFonts w:ascii="Times New Roman" w:hAnsi="Times New Roman" w:eastAsia="Times New Roman" w:cs="Times New Roman"/>
+                <w:b w:val="0"/>
+                <w:bCs w:val="0"/>
+                <w:i w:val="0"/>
+                <w:iCs w:val="0"/>
+                <w:strike w:val="0"/>
+                <w:dstrike w:val="0"/>
+                <w:noProof w:val="0"/>
+                <w:color w:val="000000" w:themeColor="text1" w:themeTint="FF" w:themeShade="FF"/>
+                <w:sz w:val="18"/>
+                <w:szCs w:val="18"/>
+                <w:u w:val="none"/>
+                <w:lang w:val="en-GB"/>
+              </w:rPr>
+              <w:t>(</w:t>
+            </w:r>
+            <w:r>
+              <w:rPr>
+                <w:rFonts w:ascii="Times New Roman" w:hAnsi="Times New Roman" w:eastAsia="Times New Roman" w:cs="Times New Roman"/>
+                <w:b w:val="0"/>
+                <w:bCs w:val="0"/>
+                <w:i w:val="0"/>
+                <w:iCs w:val="0"/>
+                <w:strike w:val="0"/>
+                <w:dstrike w:val="0"/>
+                <w:noProof w:val="0"/>
+                <w:color w:val="000000" w:themeColor="text1" w:themeTint="FF" w:themeShade="FF"/>
+                <w:sz w:val="18"/>
+                <w:szCs w:val="18"/>
+                <w:u w:val="none"/>
+                <w:lang w:val="en-GB"/>
+              </w:rPr>
+              <w:t>eviction_case_yes</w:t>
+            </w:r>
+            <w:r>
+              <w:rPr>
+                <w:rFonts w:ascii="Times New Roman" w:hAnsi="Times New Roman" w:eastAsia="Times New Roman" w:cs="Times New Roman"/>
+                <w:b w:val="0"/>
+                <w:bCs w:val="0"/>
+                <w:i w:val="0"/>
+                <w:iCs w:val="0"/>
+                <w:strike w:val="0"/>
+                <w:dstrike w:val="0"/>
+                <w:noProof w:val="0"/>
+                <w:color w:val="000000" w:themeColor="text1" w:themeTint="FF" w:themeShade="FF"/>
+                <w:sz w:val="18"/>
+                <w:szCs w:val="18"/>
+                <w:u w:val="none"/>
+                <w:lang w:val="en-GB"/>
+              </w:rPr>
+              <w:t>) }</w:t>
+            </w:r>
+            <w:r>
+              <w:rPr>
+                <w:rFonts w:ascii="Times New Roman" w:hAnsi="Times New Roman" w:eastAsia="Times New Roman" w:cs="Times New Roman"/>
+                <w:b w:val="0"/>
+                <w:bCs w:val="0"/>
+                <w:i w:val="0"/>
+                <w:iCs w:val="0"/>
+                <w:strike w:val="0"/>
+                <w:dstrike w:val="0"/>
+                <w:noProof w:val="0"/>
+                <w:color w:val="000000" w:themeColor="text1" w:themeTint="FF" w:themeShade="FF"/>
+                <w:sz w:val="18"/>
+                <w:szCs w:val="18"/>
+                <w:u w:val="none"/>
+                <w:lang w:val="en-GB"/>
+              </w:rPr>
+              <w:t xml:space="preserve">} </w:t>
+            </w:r>
+            <w:r>
+              <w:rPr>
+                <w:rFonts w:ascii="Times New Roman" w:hAnsi="Times New Roman" w:eastAsia="Times New Roman" w:cs="Times New Roman"/>
+                <w:b w:val="1"/>
+                <w:bCs w:val="1"/>
+                <w:i w:val="0"/>
+                <w:iCs w:val="0"/>
+                <w:strike w:val="0"/>
+                <w:dstrike w:val="0"/>
+                <w:noProof w:val="0"/>
+                <w:color w:val="000000" w:themeColor="text1" w:themeTint="FF" w:themeShade="FF"/>
+                <w:sz w:val="18"/>
+                <w:szCs w:val="18"/>
+                <w:u w:val="none"/>
+                <w:lang w:val="en-GB"/>
+              </w:rPr>
               <w:t xml:space="preserve">Yes </w:t>
             </w:r>
             <w:r>
@@ -618,61 +690,25 @@
                 <w:u w:val="none"/>
                 <w:lang w:val="en-GB"/>
               </w:rPr>
-              <w:t>{</w:t>
-            </w:r>
-            <w:r>
-              <w:rPr>
-                <w:rFonts w:ascii="Times New Roman" w:hAnsi="Times New Roman" w:eastAsia="Times New Roman" w:cs="Times New Roman"/>
-                <w:b w:val="0"/>
-                <w:bCs w:val="0"/>
-                <w:i w:val="0"/>
-                <w:iCs w:val="0"/>
-                <w:strike w:val="0"/>
-                <w:dstrike w:val="0"/>
-                <w:noProof w:val="0"/>
-                <w:color w:val="000000" w:themeColor="text1" w:themeTint="FF" w:themeShade="FF"/>
-                <w:sz w:val="18"/>
-                <w:szCs w:val="18"/>
-                <w:u w:val="none"/>
-                <w:lang w:val="en-GB"/>
-              </w:rPr>
-              <w:t xml:space="preserve">{ </w:t>
-            </w:r>
-            <w:r>
-              <w:rPr>
-                <w:rFonts w:ascii="Times New Roman" w:hAnsi="Times New Roman" w:eastAsia="Times New Roman" w:cs="Times New Roman"/>
-                <w:b w:val="0"/>
-                <w:bCs w:val="0"/>
-                <w:i w:val="0"/>
-                <w:iCs w:val="0"/>
-                <w:strike w:val="0"/>
-                <w:dstrike w:val="0"/>
-                <w:noProof w:val="0"/>
-                <w:color w:val="000000" w:themeColor="text1" w:themeTint="FF" w:themeShade="FF"/>
-                <w:sz w:val="18"/>
-                <w:szCs w:val="18"/>
-                <w:u w:val="none"/>
-                <w:lang w:val="en-GB"/>
-              </w:rPr>
-              <w:t>output</w:t>
-            </w:r>
-            <w:r>
-              <w:rPr>
-                <w:rFonts w:ascii="Times New Roman" w:hAnsi="Times New Roman" w:eastAsia="Times New Roman" w:cs="Times New Roman"/>
-                <w:b w:val="0"/>
-                <w:bCs w:val="0"/>
-                <w:i w:val="0"/>
-                <w:iCs w:val="0"/>
-                <w:strike w:val="0"/>
-                <w:dstrike w:val="0"/>
-                <w:noProof w:val="0"/>
-                <w:color w:val="000000" w:themeColor="text1" w:themeTint="FF" w:themeShade="FF"/>
-                <w:sz w:val="18"/>
-                <w:szCs w:val="18"/>
-                <w:u w:val="none"/>
-                <w:lang w:val="en-GB"/>
-              </w:rPr>
-              <w:t>_checkbox</w:t>
+              <w:t xml:space="preserve">{{ </w:t>
+            </w:r>
+            <w:r>
+              <w:rPr>
+                <w:rFonts w:ascii="Times New Roman" w:hAnsi="Times New Roman" w:eastAsia="Times New Roman" w:cs="Times New Roman"/>
+                <w:b w:val="0"/>
+                <w:bCs w:val="0"/>
+                <w:i w:val="0"/>
+                <w:iCs w:val="0"/>
+                <w:strike w:val="0"/>
+                <w:dstrike w:val="0"/>
+                <w:noProof w:val="0"/>
+                <w:color w:val="000000" w:themeColor="text1" w:themeTint="FF" w:themeShade="FF"/>
+                <w:sz w:val="18"/>
+                <w:szCs w:val="18"/>
+                <w:u w:val="none"/>
+                <w:lang w:val="en-GB"/>
+              </w:rPr>
+              <w:t>output_checkbox</w:t>
             </w:r>
             <w:r>
               <w:rPr>
@@ -708,25 +744,7 @@
                 <w:u w:val="none"/>
                 <w:lang w:val="en-GB"/>
               </w:rPr>
-              <w:t>eviction_case</w:t>
-            </w:r>
-            <w:r>
-              <w:rPr>
-                <w:rFonts w:ascii="Times New Roman" w:hAnsi="Times New Roman" w:eastAsia="Times New Roman" w:cs="Times New Roman"/>
-                <w:b w:val="0"/>
-                <w:bCs w:val="0"/>
-                <w:i w:val="0"/>
-                <w:iCs w:val="0"/>
-                <w:strike w:val="0"/>
-                <w:dstrike w:val="0"/>
-                <w:noProof w:val="0"/>
-                <w:color w:val="000000" w:themeColor="text1" w:themeTint="FF" w:themeShade="FF"/>
-                <w:sz w:val="18"/>
-                <w:szCs w:val="18"/>
-                <w:u w:val="none"/>
-                <w:lang w:val="en-GB"/>
-              </w:rPr>
-              <w:t>_no</w:t>
+              <w:t>eviction_case_no</w:t>
             </w:r>
             <w:r>
               <w:rPr>
@@ -762,7 +780,25 @@
                 <w:u w:val="none"/>
                 <w:lang w:val="en-GB"/>
               </w:rPr>
-              <w:t xml:space="preserve">} </w:t>
+              <w:t>}</w:t>
+            </w:r>
+            <w:r>
+              <w:rPr>
+                <w:rFonts w:ascii="Times New Roman" w:hAnsi="Times New Roman" w:eastAsia="Times New Roman" w:cs="Times New Roman"/>
+                <w:b w:val="1"/>
+                <w:bCs w:val="1"/>
+                <w:i w:val="0"/>
+                <w:iCs w:val="0"/>
+                <w:strike w:val="0"/>
+                <w:dstrike w:val="0"/>
+                <w:noProof w:val="0"/>
+                <w:color w:val="000000" w:themeColor="text1" w:themeTint="FF" w:themeShade="FF"/>
+                <w:sz w:val="18"/>
+                <w:szCs w:val="18"/>
+                <w:u w:val="none"/>
+                <w:lang w:val="en-GB"/>
+              </w:rPr>
+              <w:t xml:space="preserve"> </w:t>
             </w:r>
             <w:r>
               <w:rPr>

</xml_diff>